<commit_message>
Add three members to Team Larpers pilot plan
</commit_message>
<xml_diff>
--- a/output/submission/Route2Zero_Team_Larpers_Pilot_Plan.docx
+++ b/output/submission/Route2Zero_Team_Larpers_Pilot_Plan.docx
@@ -1858,6 +1858,300 @@
           </w:p>
         </w:tc>
       </w:tr>
+      <w:tr>
+        <w:tc>
+          <w:tcPr>
+            <w:tcW w:type="dxa" w:w="2045"/>
+            <w:tcBorders>
+              <w:top w:val="single" w:sz="10" w:color="000000"/>
+              <w:left w:val="single" w:sz="10" w:color="000000"/>
+              <w:bottom w:val="single" w:sz="10" w:color="000000"/>
+              <w:right w:val="single" w:sz="10" w:color="000000"/>
+              <w:insideH w:val="single" w:sz="10" w:color="000000"/>
+              <w:insideV w:val="single" w:sz="10" w:color="000000"/>
+            </w:tcBorders>
+            <w:tcMar>
+              <w:top w:w="80" w:type="dxa"/>
+              <w:start w:w="110" w:type="dxa"/>
+              <w:bottom w:w="80" w:type="dxa"/>
+              <w:end w:w="110" w:type="dxa"/>
+            </w:tcMar>
+            <w:vAlign w:val="top"/>
+          </w:tcPr>
+          <w:p>
+            <w:pPr>
+              <w:spacing w:after="0" w:line="240" w:lineRule="auto"/>
+            </w:pPr>
+            <w:r>
+              <w:rPr>
+                <w:rFonts w:ascii="Arial" w:hAnsi="Arial"/>
+                <w:sz w:val="15"/>
+              </w:rPr>
+              <w:t>Carl Nueva</w:t>
+            </w:r>
+          </w:p>
+        </w:tc>
+        <w:tc>
+          <w:tcPr>
+            <w:tcW w:type="dxa" w:w="2621"/>
+            <w:tcBorders>
+              <w:top w:val="single" w:sz="10" w:color="000000"/>
+              <w:left w:val="single" w:sz="10" w:color="000000"/>
+              <w:bottom w:val="single" w:sz="10" w:color="000000"/>
+              <w:right w:val="single" w:sz="10" w:color="000000"/>
+              <w:insideH w:val="single" w:sz="10" w:color="000000"/>
+              <w:insideV w:val="single" w:sz="10" w:color="000000"/>
+            </w:tcBorders>
+            <w:tcMar>
+              <w:top w:w="80" w:type="dxa"/>
+              <w:start w:w="110" w:type="dxa"/>
+              <w:bottom w:w="80" w:type="dxa"/>
+              <w:end w:w="110" w:type="dxa"/>
+            </w:tcMar>
+            <w:vAlign w:val="top"/>
+          </w:tcPr>
+          <w:p>
+            <w:pPr>
+              <w:spacing w:after="0" w:line="240" w:lineRule="auto"/>
+            </w:pPr>
+            <w:r>
+              <w:rPr>
+                <w:rFonts w:ascii="Arial" w:hAnsi="Arial"/>
+                <w:sz w:val="15"/>
+              </w:rPr>
+              <w:t>Geospatial Data Analyst</w:t>
+            </w:r>
+          </w:p>
+        </w:tc>
+        <w:tc>
+          <w:tcPr>
+            <w:tcW w:type="dxa" w:w="5069"/>
+            <w:tcBorders>
+              <w:top w:val="single" w:sz="10" w:color="000000"/>
+              <w:left w:val="single" w:sz="10" w:color="000000"/>
+              <w:bottom w:val="single" w:sz="10" w:color="000000"/>
+              <w:right w:val="single" w:sz="10" w:color="000000"/>
+              <w:insideH w:val="single" w:sz="10" w:color="000000"/>
+              <w:insideV w:val="single" w:sz="10" w:color="000000"/>
+            </w:tcBorders>
+            <w:tcMar>
+              <w:top w:w="80" w:type="dxa"/>
+              <w:start w:w="110" w:type="dxa"/>
+              <w:bottom w:w="80" w:type="dxa"/>
+              <w:end w:w="110" w:type="dxa"/>
+            </w:tcMar>
+            <w:vAlign w:val="top"/>
+          </w:tcPr>
+          <w:p>
+            <w:pPr>
+              <w:spacing w:after="0" w:line="240" w:lineRule="auto"/>
+            </w:pPr>
+            <w:r>
+              <w:rPr>
+                <w:rFonts w:ascii="Arial" w:hAnsi="Arial"/>
+                <w:sz w:val="15"/>
+              </w:rPr>
+              <w:t>Supports route geometry review, spatial data quality, map validation, and corridor evidence preparation.</w:t>
+            </w:r>
+          </w:p>
+        </w:tc>
+      </w:tr>
+      <w:tr>
+        <w:tc>
+          <w:tcPr>
+            <w:tcW w:type="dxa" w:w="2045"/>
+            <w:tcBorders>
+              <w:top w:val="single" w:sz="10" w:color="000000"/>
+              <w:left w:val="single" w:sz="10" w:color="000000"/>
+              <w:bottom w:val="single" w:sz="10" w:color="000000"/>
+              <w:right w:val="single" w:sz="10" w:color="000000"/>
+              <w:insideH w:val="single" w:sz="10" w:color="000000"/>
+              <w:insideV w:val="single" w:sz="10" w:color="000000"/>
+            </w:tcBorders>
+            <w:tcMar>
+              <w:top w:w="80" w:type="dxa"/>
+              <w:start w:w="110" w:type="dxa"/>
+              <w:bottom w:w="80" w:type="dxa"/>
+              <w:end w:w="110" w:type="dxa"/>
+            </w:tcMar>
+            <w:vAlign w:val="top"/>
+          </w:tcPr>
+          <w:p>
+            <w:pPr>
+              <w:spacing w:after="0" w:line="240" w:lineRule="auto"/>
+            </w:pPr>
+            <w:r>
+              <w:rPr>
+                <w:rFonts w:ascii="Arial" w:hAnsi="Arial"/>
+                <w:sz w:val="15"/>
+              </w:rPr>
+              <w:t>Curt Mathew Garcia</w:t>
+            </w:r>
+          </w:p>
+        </w:tc>
+        <w:tc>
+          <w:tcPr>
+            <w:tcW w:type="dxa" w:w="2621"/>
+            <w:tcBorders>
+              <w:top w:val="single" w:sz="10" w:color="000000"/>
+              <w:left w:val="single" w:sz="10" w:color="000000"/>
+              <w:bottom w:val="single" w:sz="10" w:color="000000"/>
+              <w:right w:val="single" w:sz="10" w:color="000000"/>
+              <w:insideH w:val="single" w:sz="10" w:color="000000"/>
+              <w:insideV w:val="single" w:sz="10" w:color="000000"/>
+            </w:tcBorders>
+            <w:tcMar>
+              <w:top w:w="80" w:type="dxa"/>
+              <w:start w:w="110" w:type="dxa"/>
+              <w:bottom w:w="80" w:type="dxa"/>
+              <w:end w:w="110" w:type="dxa"/>
+            </w:tcMar>
+            <w:vAlign w:val="top"/>
+          </w:tcPr>
+          <w:p>
+            <w:pPr>
+              <w:spacing w:after="0" w:line="240" w:lineRule="auto"/>
+            </w:pPr>
+            <w:r>
+              <w:rPr>
+                <w:rFonts w:ascii="Arial" w:hAnsi="Arial"/>
+                <w:sz w:val="15"/>
+              </w:rPr>
+              <w:t>Frontend and User Experience Developer</w:t>
+            </w:r>
+          </w:p>
+        </w:tc>
+        <w:tc>
+          <w:tcPr>
+            <w:tcW w:type="dxa" w:w="5069"/>
+            <w:tcBorders>
+              <w:top w:val="single" w:sz="10" w:color="000000"/>
+              <w:left w:val="single" w:sz="10" w:color="000000"/>
+              <w:bottom w:val="single" w:sz="10" w:color="000000"/>
+              <w:right w:val="single" w:sz="10" w:color="000000"/>
+              <w:insideH w:val="single" w:sz="10" w:color="000000"/>
+              <w:insideV w:val="single" w:sz="10" w:color="000000"/>
+            </w:tcBorders>
+            <w:tcMar>
+              <w:top w:w="80" w:type="dxa"/>
+              <w:start w:w="110" w:type="dxa"/>
+              <w:bottom w:w="80" w:type="dxa"/>
+              <w:end w:w="110" w:type="dxa"/>
+            </w:tcMar>
+            <w:vAlign w:val="top"/>
+          </w:tcPr>
+          <w:p>
+            <w:pPr>
+              <w:spacing w:after="0" w:line="240" w:lineRule="auto"/>
+            </w:pPr>
+            <w:r>
+              <w:rPr>
+                <w:rFonts w:ascii="Arial" w:hAnsi="Arial"/>
+                <w:sz w:val="15"/>
+              </w:rPr>
+              <w:t>Supports responsive interface development, usability improvements, and accessible user interactions.</w:t>
+            </w:r>
+          </w:p>
+        </w:tc>
+      </w:tr>
+      <w:tr>
+        <w:tc>
+          <w:tcPr>
+            <w:tcW w:type="dxa" w:w="2045"/>
+            <w:tcBorders>
+              <w:top w:val="single" w:sz="10" w:color="000000"/>
+              <w:left w:val="single" w:sz="10" w:color="000000"/>
+              <w:bottom w:val="single" w:sz="10" w:color="000000"/>
+              <w:right w:val="single" w:sz="10" w:color="000000"/>
+              <w:insideH w:val="single" w:sz="10" w:color="000000"/>
+              <w:insideV w:val="single" w:sz="10" w:color="000000"/>
+            </w:tcBorders>
+            <w:tcMar>
+              <w:top w:w="80" w:type="dxa"/>
+              <w:start w:w="110" w:type="dxa"/>
+              <w:bottom w:w="80" w:type="dxa"/>
+              <w:end w:w="110" w:type="dxa"/>
+            </w:tcMar>
+            <w:vAlign w:val="top"/>
+          </w:tcPr>
+          <w:p>
+            <w:pPr>
+              <w:spacing w:after="0" w:line="240" w:lineRule="auto"/>
+            </w:pPr>
+            <w:r>
+              <w:rPr>
+                <w:rFonts w:ascii="Arial" w:hAnsi="Arial"/>
+                <w:sz w:val="15"/>
+              </w:rPr>
+              <w:t>Marck Morgado</w:t>
+            </w:r>
+          </w:p>
+        </w:tc>
+        <w:tc>
+          <w:tcPr>
+            <w:tcW w:type="dxa" w:w="2621"/>
+            <w:tcBorders>
+              <w:top w:val="single" w:sz="10" w:color="000000"/>
+              <w:left w:val="single" w:sz="10" w:color="000000"/>
+              <w:bottom w:val="single" w:sz="10" w:color="000000"/>
+              <w:right w:val="single" w:sz="10" w:color="000000"/>
+              <w:insideH w:val="single" w:sz="10" w:color="000000"/>
+              <w:insideV w:val="single" w:sz="10" w:color="000000"/>
+            </w:tcBorders>
+            <w:tcMar>
+              <w:top w:w="80" w:type="dxa"/>
+              <w:start w:w="110" w:type="dxa"/>
+              <w:bottom w:w="80" w:type="dxa"/>
+              <w:end w:w="110" w:type="dxa"/>
+            </w:tcMar>
+            <w:vAlign w:val="top"/>
+          </w:tcPr>
+          <w:p>
+            <w:pPr>
+              <w:spacing w:after="0" w:line="240" w:lineRule="auto"/>
+            </w:pPr>
+            <w:r>
+              <w:rPr>
+                <w:rFonts w:ascii="Arial" w:hAnsi="Arial"/>
+                <w:sz w:val="15"/>
+              </w:rPr>
+              <w:t>Field Validation and Logistics Coordinator</w:t>
+            </w:r>
+          </w:p>
+        </w:tc>
+        <w:tc>
+          <w:tcPr>
+            <w:tcW w:type="dxa" w:w="5069"/>
+            <w:tcBorders>
+              <w:top w:val="single" w:sz="10" w:color="000000"/>
+              <w:left w:val="single" w:sz="10" w:color="000000"/>
+              <w:bottom w:val="single" w:sz="10" w:color="000000"/>
+              <w:right w:val="single" w:sz="10" w:color="000000"/>
+              <w:insideH w:val="single" w:sz="10" w:color="000000"/>
+              <w:insideV w:val="single" w:sz="10" w:color="000000"/>
+            </w:tcBorders>
+            <w:tcMar>
+              <w:top w:w="80" w:type="dxa"/>
+              <w:start w:w="110" w:type="dxa"/>
+              <w:bottom w:w="80" w:type="dxa"/>
+              <w:end w:w="110" w:type="dxa"/>
+            </w:tcMar>
+            <w:vAlign w:val="top"/>
+          </w:tcPr>
+          <w:p>
+            <w:pPr>
+              <w:spacing w:after="0" w:line="240" w:lineRule="auto"/>
+            </w:pPr>
+            <w:r>
+              <w:rPr>
+                <w:rFonts w:ascii="Arial" w:hAnsi="Arial"/>
+                <w:sz w:val="15"/>
+              </w:rPr>
+              <w:t>Coordinates field schedules, route-check documentation, workshop logistics, and evidence handoff.</w:t>
+            </w:r>
+          </w:p>
+        </w:tc>
+      </w:tr>
     </w:tbl>
     <w:sectPr>
       <w:footerReference w:type="default" r:id="rId12"/>

</xml_diff>

<commit_message>
Complete Route2Zero 2.0 acceptance release
</commit_message>
<xml_diff>
--- a/output/submission/Route2Zero_Team_Larpers_Pilot_Plan.docx
+++ b/output/submission/Route2Zero_Team_Larpers_Pilot_Plan.docx
@@ -2555,7 +2555,7 @@
           <w:color w:val="111111"/>
           <w:sz w:val="14"/>
         </w:rPr>
-        <w:t>Baseline traceability: build r2z-16690ccbe328 | scenario scn-c46e1d86c1 | service model service-v1-266e0b1d</w:t>
+        <w:t>Baseline traceability: build r2z-45c4ba076af9 | scenario scn-e0f12f397e | service model service-v1-266e0b1d</w:t>
       </w:r>
     </w:p>
     <w:p>
@@ -4057,9 +4057,9 @@
         <w:tblInd w:w="100" w:type="dxa"/>
       </w:tblPr>
       <w:tblGrid>
-        <w:gridCol w:w="1930"/>
+        <w:gridCol w:w="2765"/>
         <w:gridCol w:w="2592"/>
-        <w:gridCol w:w="5155"/>
+        <w:gridCol w:w="4320"/>
       </w:tblGrid>
       <w:tr>
         <w:trPr>
@@ -4068,7 +4068,7 @@
         </w:trPr>
         <w:tc>
           <w:tcPr>
-            <w:tcW w:type="dxa" w:w="1930"/>
+            <w:tcW w:type="dxa" w:w="2765"/>
             <w:shd w:fill="CFE2F3"/>
             <w:tcBorders>
               <w:top w:val="single" w:sz="9" w:color="000000"/>
@@ -4140,7 +4140,7 @@
         </w:tc>
         <w:tc>
           <w:tcPr>
-            <w:tcW w:type="dxa" w:w="5155"/>
+            <w:tcW w:type="dxa" w:w="4320"/>
             <w:shd w:fill="CFE2F3"/>
             <w:tcBorders>
               <w:top w:val="single" w:sz="9" w:color="000000"/>
@@ -4181,7 +4181,7 @@
         </w:trPr>
         <w:tc>
           <w:tcPr>
-            <w:tcW w:type="dxa" w:w="1930"/>
+            <w:tcW w:type="dxa" w:w="2765"/>
             <w:tcBorders>
               <w:top w:val="single" w:sz="9" w:color="000000"/>
               <w:left w:val="single" w:sz="9" w:color="000000"/>
@@ -4208,7 +4208,7 @@
                 <w:b w:val="0"/>
                 <w:i w:val="0"/>
                 <w:color w:val="111111"/>
-                <w:sz w:val="13"/>
+                <w:sz w:val="14"/>
               </w:rPr>
               <w:t>John Marwin Ebona</w:t>
             </w:r>
@@ -4243,7 +4243,7 @@
                 <w:b w:val="0"/>
                 <w:i w:val="0"/>
                 <w:color w:val="111111"/>
-                <w:sz w:val="13"/>
+                <w:sz w:val="14"/>
               </w:rPr>
               <w:t>Product &amp; Pilot Lead</w:t>
             </w:r>
@@ -4251,7 +4251,7 @@
         </w:tc>
         <w:tc>
           <w:tcPr>
-            <w:tcW w:type="dxa" w:w="5155"/>
+            <w:tcW w:type="dxa" w:w="4320"/>
             <w:tcBorders>
               <w:top w:val="single" w:sz="9" w:color="000000"/>
               <w:left w:val="single" w:sz="9" w:color="000000"/>
@@ -4278,7 +4278,7 @@
                 <w:b w:val="0"/>
                 <w:i w:val="0"/>
                 <w:color w:val="111111"/>
-                <w:sz w:val="13"/>
+                <w:sz w:val="14"/>
               </w:rPr>
               <w:t>City coordination, decision question, gates, integration, decision pack, handover.</w:t>
             </w:r>
@@ -4291,7 +4291,7 @@
         </w:trPr>
         <w:tc>
           <w:tcPr>
-            <w:tcW w:type="dxa" w:w="1930"/>
+            <w:tcW w:type="dxa" w:w="2765"/>
             <w:tcBorders>
               <w:top w:val="single" w:sz="9" w:color="000000"/>
               <w:left w:val="single" w:sz="9" w:color="000000"/>
@@ -4319,230 +4319,7 @@
                 <w:b w:val="0"/>
                 <w:i w:val="0"/>
                 <w:color w:val="111111"/>
-                <w:sz w:val="13"/>
-              </w:rPr>
-              <w:t>Prince Marl</w:t>
-            </w:r>
-          </w:p>
-        </w:tc>
-        <w:tc>
-          <w:tcPr>
-            <w:tcW w:type="dxa" w:w="2592"/>
-            <w:tcBorders>
-              <w:top w:val="single" w:sz="9" w:color="000000"/>
-              <w:left w:val="single" w:sz="9" w:color="000000"/>
-              <w:bottom w:val="single" w:sz="9" w:color="000000"/>
-              <w:right w:val="single" w:sz="9" w:color="000000"/>
-              <w:insideH w:val="single" w:sz="9" w:color="000000"/>
-              <w:insideV w:val="single" w:sz="9" w:color="000000"/>
-            </w:tcBorders>
-            <w:tcMar>
-              <w:top w:w="68" w:type="dxa"/>
-              <w:start w:w="100" w:type="dxa"/>
-              <w:bottom w:w="68" w:type="dxa"/>
-              <w:end w:w="100" w:type="dxa"/>
-            </w:tcMar>
-            <w:shd w:fill="F8FAFC"/>
-            <w:vAlign w:val="top"/>
-          </w:tcPr>
-          <w:p>
-            <w:pPr>
-              <w:spacing w:after="0" w:line="235" w:lineRule="auto"/>
-            </w:pPr>
-            <w:r>
-              <w:rPr>
-                <w:rFonts w:ascii="Arial" w:hAnsi="Arial"/>
-                <w:b w:val="0"/>
-                <w:i w:val="0"/>
-                <w:color w:val="111111"/>
-                <w:sz w:val="13"/>
-              </w:rPr>
-              <w:t>Data, ML &amp; Pipeline Lead</w:t>
-            </w:r>
-          </w:p>
-        </w:tc>
-        <w:tc>
-          <w:tcPr>
-            <w:tcW w:type="dxa" w:w="5155"/>
-            <w:tcBorders>
-              <w:top w:val="single" w:sz="9" w:color="000000"/>
-              <w:left w:val="single" w:sz="9" w:color="000000"/>
-              <w:bottom w:val="single" w:sz="9" w:color="000000"/>
-              <w:right w:val="single" w:sz="9" w:color="000000"/>
-              <w:insideH w:val="single" w:sz="9" w:color="000000"/>
-              <w:insideV w:val="single" w:sz="9" w:color="000000"/>
-            </w:tcBorders>
-            <w:tcMar>
-              <w:top w:w="68" w:type="dxa"/>
-              <w:start w:w="100" w:type="dxa"/>
-              <w:bottom w:w="68" w:type="dxa"/>
-              <w:end w:w="100" w:type="dxa"/>
-            </w:tcMar>
-            <w:shd w:fill="F8FAFC"/>
-            <w:vAlign w:val="top"/>
-          </w:tcPr>
-          <w:p>
-            <w:pPr>
-              <w:spacing w:after="0" w:line="235" w:lineRule="auto"/>
-            </w:pPr>
-            <w:r>
-              <w:rPr>
-                <w:rFonts w:ascii="Arial" w:hAnsi="Arial"/>
-                <w:b w:val="0"/>
-                <w:i w:val="0"/>
-                <w:color w:val="111111"/>
-                <w:sz w:val="13"/>
-              </w:rPr>
-              <w:t>Source registry, feature store, service model, metrics, build manifest, refresh.</w:t>
-            </w:r>
-          </w:p>
-        </w:tc>
-      </w:tr>
-      <w:tr>
-        <w:trPr>
-          <w:cantSplit/>
-        </w:trPr>
-        <w:tc>
-          <w:tcPr>
-            <w:tcW w:type="dxa" w:w="1930"/>
-            <w:tcBorders>
-              <w:top w:val="single" w:sz="9" w:color="000000"/>
-              <w:left w:val="single" w:sz="9" w:color="000000"/>
-              <w:bottom w:val="single" w:sz="9" w:color="000000"/>
-              <w:right w:val="single" w:sz="9" w:color="000000"/>
-              <w:insideH w:val="single" w:sz="9" w:color="000000"/>
-              <w:insideV w:val="single" w:sz="9" w:color="000000"/>
-            </w:tcBorders>
-            <w:tcMar>
-              <w:top w:w="68" w:type="dxa"/>
-              <w:start w:w="100" w:type="dxa"/>
-              <w:bottom w:w="68" w:type="dxa"/>
-              <w:end w:w="100" w:type="dxa"/>
-            </w:tcMar>
-            <w:vAlign w:val="top"/>
-          </w:tcPr>
-          <w:p>
-            <w:pPr>
-              <w:spacing w:after="0" w:line="235" w:lineRule="auto"/>
-            </w:pPr>
-            <w:r>
-              <w:rPr>
-                <w:rFonts w:ascii="Arial" w:hAnsi="Arial"/>
-                <w:b w:val="0"/>
-                <w:i w:val="0"/>
-                <w:color w:val="111111"/>
-                <w:sz w:val="13"/>
-              </w:rPr>
-              <w:t>Joaquin Sarmiento</w:t>
-            </w:r>
-          </w:p>
-        </w:tc>
-        <w:tc>
-          <w:tcPr>
-            <w:tcW w:type="dxa" w:w="2592"/>
-            <w:tcBorders>
-              <w:top w:val="single" w:sz="9" w:color="000000"/>
-              <w:left w:val="single" w:sz="9" w:color="000000"/>
-              <w:bottom w:val="single" w:sz="9" w:color="000000"/>
-              <w:right w:val="single" w:sz="9" w:color="000000"/>
-              <w:insideH w:val="single" w:sz="9" w:color="000000"/>
-              <w:insideV w:val="single" w:sz="9" w:color="000000"/>
-            </w:tcBorders>
-            <w:tcMar>
-              <w:top w:w="68" w:type="dxa"/>
-              <w:start w:w="100" w:type="dxa"/>
-              <w:bottom w:w="68" w:type="dxa"/>
-              <w:end w:w="100" w:type="dxa"/>
-            </w:tcMar>
-            <w:vAlign w:val="top"/>
-          </w:tcPr>
-          <w:p>
-            <w:pPr>
-              <w:spacing w:after="0" w:line="235" w:lineRule="auto"/>
-            </w:pPr>
-            <w:r>
-              <w:rPr>
-                <w:rFonts w:ascii="Arial" w:hAnsi="Arial"/>
-                <w:b w:val="0"/>
-                <w:i w:val="0"/>
-                <w:color w:val="111111"/>
-                <w:sz w:val="13"/>
-              </w:rPr>
-              <w:t>Transport &amp; Field Validation Lead</w:t>
-            </w:r>
-          </w:p>
-        </w:tc>
-        <w:tc>
-          <w:tcPr>
-            <w:tcW w:type="dxa" w:w="5155"/>
-            <w:tcBorders>
-              <w:top w:val="single" w:sz="9" w:color="000000"/>
-              <w:left w:val="single" w:sz="9" w:color="000000"/>
-              <w:bottom w:val="single" w:sz="9" w:color="000000"/>
-              <w:right w:val="single" w:sz="9" w:color="000000"/>
-              <w:insideH w:val="single" w:sz="9" w:color="000000"/>
-              <w:insideV w:val="single" w:sz="9" w:color="000000"/>
-            </w:tcBorders>
-            <w:tcMar>
-              <w:top w:w="68" w:type="dxa"/>
-              <w:start w:w="100" w:type="dxa"/>
-              <w:bottom w:w="68" w:type="dxa"/>
-              <w:end w:w="100" w:type="dxa"/>
-            </w:tcMar>
-            <w:vAlign w:val="top"/>
-          </w:tcPr>
-          <w:p>
-            <w:pPr>
-              <w:spacing w:after="0" w:line="235" w:lineRule="auto"/>
-            </w:pPr>
-            <w:r>
-              <w:rPr>
-                <w:rFonts w:ascii="Arial" w:hAnsi="Arial"/>
-                <w:b w:val="0"/>
-                <w:i w:val="0"/>
-                <w:color w:val="111111"/>
-                <w:sz w:val="13"/>
-              </w:rPr>
-              <w:t>Route sampling, observations, status reconciliation, assumptions, operator workflow.</w:t>
-            </w:r>
-          </w:p>
-        </w:tc>
-      </w:tr>
-      <w:tr>
-        <w:trPr>
-          <w:cantSplit/>
-        </w:trPr>
-        <w:tc>
-          <w:tcPr>
-            <w:tcW w:type="dxa" w:w="1930"/>
-            <w:tcBorders>
-              <w:top w:val="single" w:sz="9" w:color="000000"/>
-              <w:left w:val="single" w:sz="9" w:color="000000"/>
-              <w:bottom w:val="single" w:sz="9" w:color="000000"/>
-              <w:right w:val="single" w:sz="9" w:color="000000"/>
-              <w:insideH w:val="single" w:sz="9" w:color="000000"/>
-              <w:insideV w:val="single" w:sz="9" w:color="000000"/>
-            </w:tcBorders>
-            <w:tcMar>
-              <w:top w:w="68" w:type="dxa"/>
-              <w:start w:w="100" w:type="dxa"/>
-              <w:bottom w:w="68" w:type="dxa"/>
-              <w:end w:w="100" w:type="dxa"/>
-            </w:tcMar>
-            <w:shd w:fill="F8FAFC"/>
-            <w:vAlign w:val="top"/>
-          </w:tcPr>
-          <w:p>
-            <w:pPr>
-              <w:spacing w:after="0" w:line="235" w:lineRule="auto"/>
-            </w:pPr>
-            <w:r>
-              <w:rPr>
-                <w:rFonts w:ascii="Arial" w:hAnsi="Arial"/>
-                <w:b w:val="0"/>
-                <w:i w:val="0"/>
-                <w:color w:val="111111"/>
-                <w:sz w:val="13"/>
+                <w:sz w:val="14"/>
               </w:rPr>
               <w:t>Isaac Marcus</w:t>
             </w:r>
@@ -4578,15 +4355,15 @@
                 <w:b w:val="0"/>
                 <w:i w:val="0"/>
                 <w:color w:val="111111"/>
-                <w:sz w:val="13"/>
+                <w:sz w:val="14"/>
               </w:rPr>
-              <w:t>Engineering, Optimization &amp; Deployment Lead</w:t>
+              <w:t>Engineering &amp; Deployment Lead</w:t>
             </w:r>
           </w:p>
         </w:tc>
         <w:tc>
           <w:tcPr>
-            <w:tcW w:type="dxa" w:w="5155"/>
+            <w:tcW w:type="dxa" w:w="4320"/>
             <w:tcBorders>
               <w:top w:val="single" w:sz="9" w:color="000000"/>
               <w:left w:val="single" w:sz="9" w:color="000000"/>
@@ -4614,9 +4391,9 @@
                 <w:b w:val="0"/>
                 <w:i w:val="0"/>
                 <w:color w:val="111111"/>
-                <w:sz w:val="13"/>
+                <w:sz w:val="14"/>
               </w:rPr>
-              <w:t>Dashboard, scenarios, optimizer, Netlify, Mapbox, reliability, fallback behavior.</w:t>
+              <w:t>Dashboard, scenarios, Netlify, Mapbox, reliability, and deterministic fallbacks.</w:t>
             </w:r>
           </w:p>
         </w:tc>
@@ -4627,7 +4404,7 @@
         </w:trPr>
         <w:tc>
           <w:tcPr>
-            <w:tcW w:type="dxa" w:w="1930"/>
+            <w:tcW w:type="dxa" w:w="2765"/>
             <w:tcBorders>
               <w:top w:val="single" w:sz="9" w:color="000000"/>
               <w:left w:val="single" w:sz="9" w:color="000000"/>
@@ -4654,7 +4431,7 @@
                 <w:b w:val="0"/>
                 <w:i w:val="0"/>
                 <w:color w:val="111111"/>
-                <w:sz w:val="13"/>
+                <w:sz w:val="14"/>
               </w:rPr>
               <w:t>Andrei Dela Cruz</w:t>
             </w:r>
@@ -4689,15 +4466,15 @@
                 <w:b w:val="0"/>
                 <w:i w:val="0"/>
                 <w:color w:val="111111"/>
-                <w:sz w:val="13"/>
+                <w:sz w:val="14"/>
               </w:rPr>
-              <w:t>Policy, Governance &amp; Responsible AI Lead</w:t>
+              <w:t>Policy &amp; Responsible AI Lead</w:t>
             </w:r>
           </w:p>
         </w:tc>
         <w:tc>
           <w:tcPr>
-            <w:tcW w:type="dxa" w:w="5155"/>
+            <w:tcW w:type="dxa" w:w="4320"/>
             <w:tcBorders>
               <w:top w:val="single" w:sz="9" w:color="000000"/>
               <w:left w:val="single" w:sz="9" w:color="000000"/>
@@ -4724,9 +4501,9 @@
                 <w:b w:val="0"/>
                 <w:i w:val="0"/>
                 <w:color w:val="111111"/>
-                <w:sz w:val="13"/>
+                <w:sz w:val="14"/>
               </w:rPr>
-              <w:t>Policy controls, decision rights, workshops, risk/change control, responsible AI.</w:t>
+              <w:t>Policy controls, decision rights, workshops, risk controls, and responsible AI.</w:t>
             </w:r>
           </w:p>
         </w:tc>
@@ -4737,7 +4514,7 @@
         </w:trPr>
         <w:tc>
           <w:tcPr>
-            <w:tcW w:type="dxa" w:w="1930"/>
+            <w:tcW w:type="dxa" w:w="2765"/>
             <w:tcBorders>
               <w:top w:val="single" w:sz="9" w:color="000000"/>
               <w:left w:val="single" w:sz="9" w:color="000000"/>
@@ -4765,7 +4542,7 @@
                 <w:b w:val="0"/>
                 <w:i w:val="0"/>
                 <w:color w:val="111111"/>
-                <w:sz w:val="13"/>
+                <w:sz w:val="14"/>
               </w:rPr>
               <w:t>Russel Mendez</w:t>
             </w:r>
@@ -4801,15 +4578,15 @@
                 <w:b w:val="0"/>
                 <w:i w:val="0"/>
                 <w:color w:val="111111"/>
-                <w:sz w:val="13"/>
+                <w:sz w:val="14"/>
               </w:rPr>
-              <w:t>Climate, Research &amp; Evidence Lead</w:t>
+              <w:t>Climate &amp; Evidence Lead</w:t>
             </w:r>
           </w:p>
         </w:tc>
         <w:tc>
           <w:tcPr>
-            <w:tcW w:type="dxa" w:w="5155"/>
+            <w:tcW w:type="dxa" w:w="4320"/>
             <w:tcBorders>
               <w:top w:val="single" w:sz="9" w:color="000000"/>
               <w:left w:val="single" w:sz="9" w:color="000000"/>
@@ -4837,9 +4614,9 @@
                 <w:b w:val="0"/>
                 <w:i w:val="0"/>
                 <w:color w:val="111111"/>
-                <w:sz w:val="13"/>
+                <w:sz w:val="14"/>
               </w:rPr>
-              <w:t>Climate/energy method, source validation, confidence framework, documentation.</w:t>
+              <w:t>Climate and energy method, source review, evidence confidence, and documentation.</w:t>
             </w:r>
           </w:p>
         </w:tc>
@@ -4850,7 +4627,7 @@
         </w:trPr>
         <w:tc>
           <w:tcPr>
-            <w:tcW w:type="dxa" w:w="1930"/>
+            <w:tcW w:type="dxa" w:w="2765"/>
             <w:tcBorders>
               <w:top w:val="single" w:sz="9" w:color="000000"/>
               <w:left w:val="single" w:sz="9" w:color="000000"/>
@@ -4877,9 +4654,9 @@
                 <w:b w:val="0"/>
                 <w:i w:val="0"/>
                 <w:color w:val="111111"/>
-                <w:sz w:val="13"/>
+                <w:sz w:val="14"/>
               </w:rPr>
-              <w:t>Tj Moreno</w:t>
+              <w:t>TRISTIAN JAMES CABALAR</w:t>
             </w:r>
           </w:p>
         </w:tc>
@@ -4912,15 +4689,15 @@
                 <w:b w:val="0"/>
                 <w:i w:val="0"/>
                 <w:color w:val="111111"/>
-                <w:sz w:val="13"/>
+                <w:sz w:val="14"/>
               </w:rPr>
-              <w:t>Stakeholder &amp; Partnership Lead</w:t>
+              <w:t>Data &amp; ML Lead</w:t>
             </w:r>
           </w:p>
         </w:tc>
         <w:tc>
           <w:tcPr>
-            <w:tcW w:type="dxa" w:w="5155"/>
+            <w:tcW w:type="dxa" w:w="4320"/>
             <w:tcBorders>
               <w:top w:val="single" w:sz="9" w:color="000000"/>
               <w:left w:val="single" w:sz="9" w:color="000000"/>
@@ -4947,9 +4724,9 @@
                 <w:b w:val="0"/>
                 <w:i w:val="0"/>
                 <w:color w:val="111111"/>
-                <w:sz w:val="13"/>
+                <w:sz w:val="14"/>
               </w:rPr>
-              <w:t>LGU, operator, rider/community, utility and finance coordination and consent.</w:t>
+              <w:t>Source registry, feature store, service model, metrics, manifest, and model refresh.</w:t>
             </w:r>
           </w:p>
         </w:tc>
@@ -4960,7 +4737,7 @@
         </w:trPr>
         <w:tc>
           <w:tcPr>
-            <w:tcW w:type="dxa" w:w="1930"/>
+            <w:tcW w:type="dxa" w:w="2765"/>
             <w:tcBorders>
               <w:top w:val="single" w:sz="9" w:color="000000"/>
               <w:left w:val="single" w:sz="9" w:color="000000"/>
@@ -4988,9 +4765,9 @@
                 <w:b w:val="0"/>
                 <w:i w:val="0"/>
                 <w:color w:val="111111"/>
-                <w:sz w:val="13"/>
+                <w:sz w:val="14"/>
               </w:rPr>
-              <w:t>JM Palaganas</w:t>
+              <w:t>JOHN MICHAEL PALAGANAS</w:t>
             </w:r>
           </w:p>
         </w:tc>
@@ -5024,15 +4801,15 @@
                 <w:b w:val="0"/>
                 <w:i w:val="0"/>
                 <w:color w:val="111111"/>
-                <w:sz w:val="13"/>
+                <w:sz w:val="14"/>
               </w:rPr>
-              <w:t>QA, Testing &amp; Documentation Lead</w:t>
+              <w:t>QA &amp; Documentation Lead</w:t>
             </w:r>
           </w:p>
         </w:tc>
         <w:tc>
           <w:tcPr>
-            <w:tcW w:type="dxa" w:w="5155"/>
+            <w:tcW w:type="dxa" w:w="4320"/>
             <w:tcBorders>
               <w:top w:val="single" w:sz="9" w:color="000000"/>
               <w:left w:val="single" w:sz="9" w:color="000000"/>
@@ -5060,9 +4837,9 @@
                 <w:b w:val="0"/>
                 <w:i w:val="0"/>
                 <w:color w:val="111111"/>
-                <w:sz w:val="13"/>
+                <w:sz w:val="14"/>
               </w:rPr>
-              <w:t>Testing, accessibility, artifact QA, claim-output checks, issue tracking.</w:t>
+              <w:t>Testing, accessibility, artifact QA, claim checks, and issue tracking.</w:t>
             </w:r>
           </w:p>
         </w:tc>
@@ -5073,7 +4850,7 @@
         </w:trPr>
         <w:tc>
           <w:tcPr>
-            <w:tcW w:type="dxa" w:w="1930"/>
+            <w:tcW w:type="dxa" w:w="2765"/>
             <w:tcBorders>
               <w:top w:val="single" w:sz="9" w:color="000000"/>
               <w:left w:val="single" w:sz="9" w:color="000000"/>
@@ -5100,7 +4877,7 @@
                 <w:b w:val="0"/>
                 <w:i w:val="0"/>
                 <w:color w:val="111111"/>
-                <w:sz w:val="13"/>
+                <w:sz w:val="14"/>
               </w:rPr>
               <w:t>Carl Nueva</w:t>
             </w:r>
@@ -5135,7 +4912,7 @@
                 <w:b w:val="0"/>
                 <w:i w:val="0"/>
                 <w:color w:val="111111"/>
-                <w:sz w:val="13"/>
+                <w:sz w:val="14"/>
               </w:rPr>
               <w:t>Geospatial &amp; Infrastructure Analyst</w:t>
             </w:r>
@@ -5143,7 +4920,7 @@
         </w:tc>
         <w:tc>
           <w:tcPr>
-            <w:tcW w:type="dxa" w:w="5155"/>
+            <w:tcW w:type="dxa" w:w="4320"/>
             <w:tcBorders>
               <w:top w:val="single" w:sz="9" w:color="000000"/>
               <w:left w:val="single" w:sz="9" w:color="000000"/>
@@ -5170,9 +4947,9 @@
                 <w:b w:val="0"/>
                 <w:i w:val="0"/>
                 <w:color w:val="111111"/>
-                <w:sz w:val="13"/>
+                <w:sz w:val="14"/>
               </w:rPr>
-              <w:t>Geometry review, spatial joins, equity layers, charging/power evidence, map QA.</w:t>
+              <w:t>Geometry review, spatial joins, equity layers, power evidence, and map QA.</w:t>
             </w:r>
           </w:p>
         </w:tc>
@@ -5183,7 +4960,7 @@
         </w:trPr>
         <w:tc>
           <w:tcPr>
-            <w:tcW w:type="dxa" w:w="1930"/>
+            <w:tcW w:type="dxa" w:w="2765"/>
             <w:tcBorders>
               <w:top w:val="single" w:sz="9" w:color="000000"/>
               <w:left w:val="single" w:sz="9" w:color="000000"/>
@@ -5211,9 +4988,9 @@
                 <w:b w:val="0"/>
                 <w:i w:val="0"/>
                 <w:color w:val="111111"/>
-                <w:sz w:val="13"/>
+                <w:sz w:val="14"/>
               </w:rPr>
-              <w:t>Curt Mathew Garcia</w:t>
+              <w:t>JOSEPH CLARENCE PARAYAOAN</w:t>
             </w:r>
           </w:p>
         </w:tc>
@@ -5247,15 +5024,15 @@
                 <w:b w:val="0"/>
                 <w:i w:val="0"/>
                 <w:color w:val="111111"/>
-                <w:sz w:val="13"/>
+                <w:sz w:val="14"/>
               </w:rPr>
-              <w:t>Frontend &amp; UX Developer</w:t>
+              <w:t>Field Validation &amp; Partnerships Lead</w:t>
             </w:r>
           </w:p>
         </w:tc>
         <w:tc>
           <w:tcPr>
-            <w:tcW w:type="dxa" w:w="5155"/>
+            <w:tcW w:type="dxa" w:w="4320"/>
             <w:tcBorders>
               <w:top w:val="single" w:sz="9" w:color="000000"/>
               <w:left w:val="single" w:sz="9" w:color="000000"/>
@@ -5283,119 +5060,9 @@
                 <w:b w:val="0"/>
                 <w:i w:val="0"/>
                 <w:color w:val="111111"/>
-                <w:sz w:val="13"/>
+                <w:sz w:val="14"/>
               </w:rPr>
-              <w:t>Responsive Route Lens, portfolio UX, walkthrough mode, usability, accessibility.</w:t>
-            </w:r>
-          </w:p>
-        </w:tc>
-      </w:tr>
-      <w:tr>
-        <w:trPr>
-          <w:cantSplit/>
-        </w:trPr>
-        <w:tc>
-          <w:tcPr>
-            <w:tcW w:type="dxa" w:w="1930"/>
-            <w:tcBorders>
-              <w:top w:val="single" w:sz="9" w:color="000000"/>
-              <w:left w:val="single" w:sz="9" w:color="000000"/>
-              <w:bottom w:val="single" w:sz="9" w:color="000000"/>
-              <w:right w:val="single" w:sz="9" w:color="000000"/>
-              <w:insideH w:val="single" w:sz="9" w:color="000000"/>
-              <w:insideV w:val="single" w:sz="9" w:color="000000"/>
-            </w:tcBorders>
-            <w:tcMar>
-              <w:top w:w="68" w:type="dxa"/>
-              <w:start w:w="100" w:type="dxa"/>
-              <w:bottom w:w="68" w:type="dxa"/>
-              <w:end w:w="100" w:type="dxa"/>
-            </w:tcMar>
-            <w:vAlign w:val="top"/>
-          </w:tcPr>
-          <w:p>
-            <w:pPr>
-              <w:spacing w:after="0" w:line="235" w:lineRule="auto"/>
-            </w:pPr>
-            <w:r>
-              <w:rPr>
-                <w:rFonts w:ascii="Arial" w:hAnsi="Arial"/>
-                <w:b w:val="0"/>
-                <w:i w:val="0"/>
-                <w:color w:val="111111"/>
-                <w:sz w:val="13"/>
-              </w:rPr>
-              <w:t>Marck Morgado</w:t>
-            </w:r>
-          </w:p>
-        </w:tc>
-        <w:tc>
-          <w:tcPr>
-            <w:tcW w:type="dxa" w:w="2592"/>
-            <w:tcBorders>
-              <w:top w:val="single" w:sz="9" w:color="000000"/>
-              <w:left w:val="single" w:sz="9" w:color="000000"/>
-              <w:bottom w:val="single" w:sz="9" w:color="000000"/>
-              <w:right w:val="single" w:sz="9" w:color="000000"/>
-              <w:insideH w:val="single" w:sz="9" w:color="000000"/>
-              <w:insideV w:val="single" w:sz="9" w:color="000000"/>
-            </w:tcBorders>
-            <w:tcMar>
-              <w:top w:w="68" w:type="dxa"/>
-              <w:start w:w="100" w:type="dxa"/>
-              <w:bottom w:w="68" w:type="dxa"/>
-              <w:end w:w="100" w:type="dxa"/>
-            </w:tcMar>
-            <w:vAlign w:val="top"/>
-          </w:tcPr>
-          <w:p>
-            <w:pPr>
-              <w:spacing w:after="0" w:line="235" w:lineRule="auto"/>
-            </w:pPr>
-            <w:r>
-              <w:rPr>
-                <w:rFonts w:ascii="Arial" w:hAnsi="Arial"/>
-                <w:b w:val="0"/>
-                <w:i w:val="0"/>
-                <w:color w:val="111111"/>
-                <w:sz w:val="13"/>
-              </w:rPr>
-              <w:t>Field Validation &amp; Logistics Coordinator</w:t>
-            </w:r>
-          </w:p>
-        </w:tc>
-        <w:tc>
-          <w:tcPr>
-            <w:tcW w:type="dxa" w:w="5155"/>
-            <w:tcBorders>
-              <w:top w:val="single" w:sz="9" w:color="000000"/>
-              <w:left w:val="single" w:sz="9" w:color="000000"/>
-              <w:bottom w:val="single" w:sz="9" w:color="000000"/>
-              <w:right w:val="single" w:sz="9" w:color="000000"/>
-              <w:insideH w:val="single" w:sz="9" w:color="000000"/>
-              <w:insideV w:val="single" w:sz="9" w:color="000000"/>
-            </w:tcBorders>
-            <w:tcMar>
-              <w:top w:w="68" w:type="dxa"/>
-              <w:start w:w="100" w:type="dxa"/>
-              <w:bottom w:w="68" w:type="dxa"/>
-              <w:end w:w="100" w:type="dxa"/>
-            </w:tcMar>
-            <w:vAlign w:val="top"/>
-          </w:tcPr>
-          <w:p>
-            <w:pPr>
-              <w:spacing w:after="0" w:line="235" w:lineRule="auto"/>
-            </w:pPr>
-            <w:r>
-              <w:rPr>
-                <w:rFonts w:ascii="Arial" w:hAnsi="Arial"/>
-                <w:b w:val="0"/>
-                <w:i w:val="0"/>
-                <w:color w:val="111111"/>
-                <w:sz w:val="13"/>
-              </w:rPr>
-              <w:t>Field schedules, forms, route-check records, evidence handoff, logistics.</w:t>
+              <w:t>Field plans, route checks, operator and partner coordination, and evidence handoff.</w:t>
             </w:r>
           </w:p>
         </w:tc>

</xml_diff>

<commit_message>
Publish Route2Zero 2.1 release artifacts
</commit_message>
<xml_diff>
--- a/output/submission/Route2Zero_Team_Larpers_Pilot_Plan.docx
+++ b/output/submission/Route2Zero_Team_Larpers_Pilot_Plan.docx
@@ -4,6 +4,8 @@
   <w:body>
     <w:p>
       <w:pPr>
+        <w:keepNext/>
+        <w:pageBreakBefore w:val="0"/>
         <w:spacing w:after="20"/>
         <w:ind w:left="-1123" w:right="-1123"/>
       </w:pPr>
@@ -44,6 +46,7 @@
     </w:p>
     <w:p>
       <w:pPr>
+        <w:keepNext/>
         <w:spacing w:before="0" w:after="20"/>
       </w:pPr>
       <w:hyperlink r:id="rId11">
@@ -81,6 +84,7 @@
     </w:p>
     <w:p>
       <w:pPr>
+        <w:keepNext/>
         <w:spacing w:before="0" w:after="40"/>
         <w:jc w:val="right"/>
       </w:pPr>
@@ -224,7 +228,7 @@
           <w:color w:val="111111"/>
           <w:sz w:val="18"/>
         </w:rPr>
-        <w:t>Convert Route2Zero 2.0 from an evidence-based prototype into a locally validated planning workflow that cities can inspect, challenge, refresh, and own.</w:t>
+        <w:t>Convert Route2Zero 2.1 from an evidence-based prototype into a locally validated planning workflow that cities can inspect, challenge, refresh, and own.</w:t>
       </w:r>
     </w:p>
     <w:p>
@@ -943,12 +947,9 @@
       </w:tr>
     </w:tbl>
     <w:p>
-      <w:r>
-        <w:br w:type="page"/>
-      </w:r>
-    </w:p>
-    <w:p>
       <w:pPr>
+        <w:keepNext/>
+        <w:pageBreakBefore/>
         <w:spacing w:after="20"/>
         <w:ind w:left="-1123" w:right="-1123"/>
       </w:pPr>
@@ -989,6 +990,7 @@
     </w:p>
     <w:p>
       <w:pPr>
+        <w:keepNext/>
         <w:spacing w:before="0" w:after="20"/>
       </w:pPr>
       <w:hyperlink r:id="rId11">
@@ -1026,6 +1028,7 @@
     </w:p>
     <w:p>
       <w:pPr>
+        <w:keepNext/>
         <w:spacing w:before="0" w:after="40"/>
         <w:jc w:val="right"/>
       </w:pPr>
@@ -1474,7 +1477,7 @@
                 <w:color w:val="111111"/>
                 <w:sz w:val="14"/>
               </w:rPr>
-              <w:t>Desk/field-check routes; observe service; validate geometry; collect operator, charging/depot, and local equity/accessibility evidence.</w:t>
+              <w:t>Extend the hackathon's 20-route OSM validation seed with field observation; validate geometry and service; collect operator, charging/depot, and local equity/accessibility evidence.</w:t>
             </w:r>
           </w:p>
         </w:tc>
@@ -1510,7 +1513,7 @@
                 <w:color w:val="111111"/>
                 <w:sz w:val="14"/>
               </w:rPr>
-              <w:t>Updated validation, operator, and charging ledgers; ground-truth sample; source refresh.</w:t>
+              <w:t>Expanded validation, operator, and charging ledgers; ground-truth sample; source refresh.</w:t>
             </w:r>
           </w:p>
         </w:tc>
@@ -2555,16 +2558,13 @@
           <w:color w:val="111111"/>
           <w:sz w:val="14"/>
         </w:rPr>
-        <w:t>Baseline traceability: build r2z-45c4ba076af9 | scenario scn-e0f12f397e | service model service-v1-266e0b1d</w:t>
-      </w:r>
-    </w:p>
-    <w:p>
-      <w:r>
-        <w:br w:type="page"/>
+        <w:t>Baseline traceability: build r2z-d4c8d4cc709a | scenario scn-e0f12f397e | service model service-v1-266e0b1d</w:t>
       </w:r>
     </w:p>
     <w:p>
       <w:pPr>
+        <w:keepNext/>
+        <w:pageBreakBefore/>
         <w:spacing w:after="20"/>
         <w:ind w:left="-1123" w:right="-1123"/>
       </w:pPr>
@@ -2605,6 +2605,7 @@
     </w:p>
     <w:p>
       <w:pPr>
+        <w:keepNext/>
         <w:spacing w:before="0" w:after="20"/>
       </w:pPr>
       <w:hyperlink r:id="rId11">
@@ -2642,6 +2643,7 @@
     </w:p>
     <w:p>
       <w:pPr>
+        <w:keepNext/>
         <w:spacing w:before="0" w:after="40"/>
         <w:jc w:val="right"/>
       </w:pPr>
@@ -3683,7 +3685,7 @@
                 <w:color w:val="111111"/>
                 <w:sz w:val="15"/>
               </w:rPr>
-              <w:t>Keep neutral prior explicit and raise validation priority.</w:t>
+              <w:t>Keep neutral prior explicit and raise validation priority; a named desk reference is not readiness evidence.</w:t>
             </w:r>
           </w:p>
         </w:tc>
@@ -3723,6 +3725,82 @@
                 <w:color w:val="111111"/>
                 <w:sz w:val="15"/>
               </w:rPr>
+              <w:t>Cost/financing data unverified</w:t>
+            </w:r>
+          </w:p>
+        </w:tc>
+        <w:tc>
+          <w:tcPr>
+            <w:tcW w:type="dxa" w:w="7445"/>
+            <w:tcBorders>
+              <w:top w:val="single" w:sz="9" w:color="000000"/>
+              <w:left w:val="single" w:sz="9" w:color="000000"/>
+              <w:bottom w:val="single" w:sz="9" w:color="000000"/>
+              <w:right w:val="single" w:sz="9" w:color="000000"/>
+              <w:insideH w:val="single" w:sz="9" w:color="000000"/>
+              <w:insideV w:val="single" w:sz="9" w:color="000000"/>
+            </w:tcBorders>
+            <w:tcMar>
+              <w:top w:w="68" w:type="dxa"/>
+              <w:start w:w="100" w:type="dxa"/>
+              <w:bottom w:w="68" w:type="dxa"/>
+              <w:end w:w="100" w:type="dxa"/>
+            </w:tcMar>
+            <w:vAlign w:val="top"/>
+          </w:tcPr>
+          <w:p>
+            <w:pPr>
+              <w:spacing w:after="0" w:line="235" w:lineRule="auto"/>
+            </w:pPr>
+            <w:r>
+              <w:rPr>
+                <w:rFonts w:ascii="Arial" w:hAnsi="Arial"/>
+                <w:b w:val="0"/>
+                <w:i w:val="0"/>
+                <w:color w:val="111111"/>
+                <w:sz w:val="15"/>
+              </w:rPr>
+              <w:t>Treat feasibility figures as PROXY/SCENARIO until fleet and tariff data are confirmed; never present them as a budget.</w:t>
+            </w:r>
+          </w:p>
+        </w:tc>
+      </w:tr>
+      <w:tr>
+        <w:trPr>
+          <w:cantSplit/>
+        </w:trPr>
+        <w:tc>
+          <w:tcPr>
+            <w:tcW w:type="dxa" w:w="2232"/>
+            <w:tcBorders>
+              <w:top w:val="single" w:sz="9" w:color="000000"/>
+              <w:left w:val="single" w:sz="9" w:color="000000"/>
+              <w:bottom w:val="single" w:sz="9" w:color="000000"/>
+              <w:right w:val="single" w:sz="9" w:color="000000"/>
+              <w:insideH w:val="single" w:sz="9" w:color="000000"/>
+              <w:insideV w:val="single" w:sz="9" w:color="000000"/>
+            </w:tcBorders>
+            <w:tcMar>
+              <w:top w:w="68" w:type="dxa"/>
+              <w:start w:w="100" w:type="dxa"/>
+              <w:bottom w:w="68" w:type="dxa"/>
+              <w:end w:w="100" w:type="dxa"/>
+            </w:tcMar>
+            <w:shd w:fill="F8FAFC"/>
+            <w:vAlign w:val="top"/>
+          </w:tcPr>
+          <w:p>
+            <w:pPr>
+              <w:spacing w:after="0" w:line="235" w:lineRule="auto"/>
+            </w:pPr>
+            <w:r>
+              <w:rPr>
+                <w:rFonts w:ascii="Arial" w:hAnsi="Arial"/>
+                <w:b w:val="0"/>
+                <w:i w:val="0"/>
+                <w:color w:val="111111"/>
+                <w:sz w:val="15"/>
+              </w:rPr>
               <w:t>Sparse geometry / equity data</w:t>
             </w:r>
           </w:p>
@@ -3744,6 +3822,7 @@
               <w:bottom w:w="68" w:type="dxa"/>
               <w:end w:w="100" w:type="dxa"/>
             </w:tcMar>
+            <w:shd w:fill="F8FAFC"/>
             <w:vAlign w:val="top"/>
           </w:tcPr>
           <w:p>
@@ -3784,7 +3863,6 @@
               <w:bottom w:w="68" w:type="dxa"/>
               <w:end w:w="100" w:type="dxa"/>
             </w:tcMar>
-            <w:shd w:fill="F8FAFC"/>
             <w:vAlign w:val="top"/>
           </w:tcPr>
           <w:p>
@@ -3820,7 +3898,6 @@
               <w:bottom w:w="68" w:type="dxa"/>
               <w:end w:w="100" w:type="dxa"/>
             </w:tcMar>
-            <w:shd w:fill="F8FAFC"/>
             <w:vAlign w:val="top"/>
           </w:tcPr>
           <w:p>
@@ -3861,6 +3938,7 @@
               <w:bottom w:w="68" w:type="dxa"/>
               <w:end w:w="100" w:type="dxa"/>
             </w:tcMar>
+            <w:shd w:fill="F8FAFC"/>
             <w:vAlign w:val="top"/>
           </w:tcPr>
           <w:p>
@@ -3896,6 +3974,7 @@
               <w:bottom w:w="68" w:type="dxa"/>
               <w:end w:w="100" w:type="dxa"/>
             </w:tcMar>
+            <w:shd w:fill="F8FAFC"/>
             <w:vAlign w:val="top"/>
           </w:tcPr>
           <w:p>
@@ -3917,12 +3996,9 @@
       </w:tr>
     </w:tbl>
     <w:p>
-      <w:r>
-        <w:br w:type="page"/>
-      </w:r>
-    </w:p>
-    <w:p>
       <w:pPr>
+        <w:keepNext/>
+        <w:pageBreakBefore/>
         <w:spacing w:after="20"/>
         <w:ind w:left="-1123" w:right="-1123"/>
       </w:pPr>
@@ -3963,6 +4039,7 @@
     </w:p>
     <w:p>
       <w:pPr>
+        <w:keepNext/>
         <w:spacing w:before="0" w:after="20"/>
       </w:pPr>
       <w:hyperlink r:id="rId11">
@@ -4000,6 +4077,926 @@
     </w:p>
     <w:p>
       <w:pPr>
+        <w:keepNext/>
+        <w:spacing w:before="0" w:after="40"/>
+        <w:jc w:val="right"/>
+      </w:pPr>
+      <w:r>
+        <w:rPr>
+          <w:rFonts w:ascii="Arial" w:hAnsi="Arial"/>
+          <w:b/>
+          <w:i w:val="0"/>
+          <w:color w:val="4B5563"/>
+          <w:sz w:val="14"/>
+        </w:rPr>
+        <w:t>FINANCIAL FEASIBILITY / DATA LICENSING</w:t>
+      </w:r>
+    </w:p>
+    <w:p>
+      <w:pPr>
+        <w:pStyle w:val="Title"/>
+        <w:keepNext/>
+        <w:spacing w:before="20" w:after="40"/>
+      </w:pPr>
+      <w:r>
+        <w:rPr>
+          <w:rFonts w:ascii="Arial" w:hAnsi="Arial"/>
+          <w:b/>
+          <w:i w:val="0"/>
+          <w:color w:val="111111"/>
+          <w:sz w:val="38"/>
+        </w:rPr>
+        <w:t>Validate the economics with the same discipline as the climate case</w:t>
+      </w:r>
+    </w:p>
+    <w:tbl>
+      <w:tblPr>
+        <w:tblW w:type="dxa" w:w="9677"/>
+        <w:jc w:val="center"/>
+        <w:tblLayout w:type="fixed"/>
+        <w:tblLook w:firstColumn="1" w:firstRow="1" w:lastColumn="0" w:lastRow="0" w:noHBand="0" w:noVBand="1" w:val="04A0"/>
+        <w:tblInd w:w="140" w:type="dxa"/>
+      </w:tblPr>
+      <w:tblGrid>
+        <w:gridCol w:w="9677"/>
+      </w:tblGrid>
+      <w:tr>
+        <w:trPr>
+          <w:tblHeader w:val="true"/>
+        </w:trPr>
+        <w:tc>
+          <w:tcPr>
+            <w:tcW w:type="dxa" w:w="9677"/>
+            <w:shd w:fill="F5F8FC"/>
+            <w:tcBorders>
+              <w:top w:val="single" w:sz="8" w:color="9FBAD0"/>
+              <w:left w:val="single" w:sz="8" w:color="9FBAD0"/>
+              <w:bottom w:val="single" w:sz="8" w:color="9FBAD0"/>
+              <w:right w:val="single" w:sz="8" w:color="9FBAD0"/>
+              <w:insideH w:val="single" w:sz="8" w:color="9FBAD0"/>
+              <w:insideV w:val="single" w:sz="8" w:color="9FBAD0"/>
+            </w:tcBorders>
+            <w:tcMar>
+              <w:top w:w="110" w:type="dxa"/>
+              <w:start w:w="140" w:type="dxa"/>
+              <w:bottom w:w="110" w:type="dxa"/>
+              <w:end w:w="140" w:type="dxa"/>
+            </w:tcMar>
+          </w:tcPr>
+          <w:p>
+            <w:pPr>
+              <w:spacing w:after="40"/>
+            </w:pPr>
+            <w:r>
+              <w:rPr>
+                <w:rFonts w:ascii="Arial" w:hAnsi="Arial"/>
+                <w:b/>
+                <w:i w:val="0"/>
+                <w:color w:val="0B2E59"/>
+                <w:sz w:val="18"/>
+              </w:rPr>
+              <w:t>Starting-point scenario — not a budget</w:t>
+            </w:r>
+          </w:p>
+          <w:p>
+            <w:pPr>
+              <w:spacing w:after="0" w:line="252" w:lineRule="auto"/>
+            </w:pPr>
+            <w:r>
+              <w:rPr>
+                <w:rFonts w:ascii="Arial" w:hAnsi="Arial"/>
+                <w:b w:val="0"/>
+                <w:i w:val="0"/>
+                <w:color w:val="111111"/>
+                <w:sz w:val="18"/>
+              </w:rPr>
+              <w:t>The Phase-1 shortlist currently implies about 1,943 vehicles, 102 chargers, and PHP 4.91 billion in vehicle-plus-charger hardware under explicit PROXY assumptions. Financing terms remain MISSING, and excluded costs are not silently absorbed.</w:t>
+            </w:r>
+          </w:p>
+        </w:tc>
+      </w:tr>
+    </w:tbl>
+    <w:p>
+      <w:pPr>
+        <w:pStyle w:val="Heading1"/>
+        <w:keepNext/>
+        <w:spacing w:before="80" w:after="40"/>
+      </w:pPr>
+      <w:r>
+        <w:rPr>
+          <w:rFonts w:ascii="Arial" w:hAnsi="Arial"/>
+          <w:b/>
+          <w:i w:val="0"/>
+          <w:color w:val="0B2E59"/>
+          <w:sz w:val="23"/>
+        </w:rPr>
+        <w:t>FINANCIAL FEASIBILITY APPROACH</w:t>
+      </w:r>
+    </w:p>
+    <w:tbl>
+      <w:tblPr>
+        <w:tblW w:type="dxa" w:w="9677"/>
+        <w:jc w:val="center"/>
+        <w:tblLayout w:type="fixed"/>
+        <w:tblLook w:firstColumn="1" w:firstRow="1" w:lastColumn="0" w:lastRow="0" w:noHBand="0" w:noVBand="1" w:val="04A0"/>
+        <w:tblInd w:w="100" w:type="dxa"/>
+      </w:tblPr>
+      <w:tblGrid>
+        <w:gridCol w:w="1656"/>
+        <w:gridCol w:w="2376"/>
+        <w:gridCol w:w="5645"/>
+      </w:tblGrid>
+      <w:tr>
+        <w:trPr>
+          <w:tblHeader w:val="true"/>
+          <w:cantSplit/>
+        </w:trPr>
+        <w:tc>
+          <w:tcPr>
+            <w:tcW w:type="dxa" w:w="1656"/>
+            <w:shd w:fill="CFE2F3"/>
+            <w:tcBorders>
+              <w:top w:val="single" w:sz="9" w:color="000000"/>
+              <w:left w:val="single" w:sz="9" w:color="000000"/>
+              <w:bottom w:val="single" w:sz="9" w:color="000000"/>
+              <w:right w:val="single" w:sz="9" w:color="000000"/>
+              <w:insideH w:val="single" w:sz="9" w:color="000000"/>
+              <w:insideV w:val="single" w:sz="9" w:color="000000"/>
+            </w:tcBorders>
+            <w:tcMar>
+              <w:top w:w="82" w:type="dxa"/>
+              <w:start w:w="100" w:type="dxa"/>
+              <w:bottom w:w="82" w:type="dxa"/>
+              <w:end w:w="100" w:type="dxa"/>
+            </w:tcMar>
+            <w:vAlign w:val="center"/>
+          </w:tcPr>
+          <w:p>
+            <w:pPr>
+              <w:spacing w:after="0"/>
+            </w:pPr>
+            <w:r>
+              <w:rPr>
+                <w:rFonts w:ascii="Arial" w:hAnsi="Arial"/>
+                <w:b w:val="0"/>
+                <w:i w:val="0"/>
+                <w:color w:val="111111"/>
+                <w:sz w:val="16"/>
+              </w:rPr>
+              <w:t>Input</w:t>
+            </w:r>
+          </w:p>
+        </w:tc>
+        <w:tc>
+          <w:tcPr>
+            <w:tcW w:type="dxa" w:w="2376"/>
+            <w:shd w:fill="CFE2F3"/>
+            <w:tcBorders>
+              <w:top w:val="single" w:sz="9" w:color="000000"/>
+              <w:left w:val="single" w:sz="9" w:color="000000"/>
+              <w:bottom w:val="single" w:sz="9" w:color="000000"/>
+              <w:right w:val="single" w:sz="9" w:color="000000"/>
+              <w:insideH w:val="single" w:sz="9" w:color="000000"/>
+              <w:insideV w:val="single" w:sz="9" w:color="000000"/>
+            </w:tcBorders>
+            <w:tcMar>
+              <w:top w:w="82" w:type="dxa"/>
+              <w:start w:w="100" w:type="dxa"/>
+              <w:bottom w:w="82" w:type="dxa"/>
+              <w:end w:w="100" w:type="dxa"/>
+            </w:tcMar>
+            <w:vAlign w:val="center"/>
+          </w:tcPr>
+          <w:p>
+            <w:pPr>
+              <w:spacing w:after="0"/>
+            </w:pPr>
+            <w:r>
+              <w:rPr>
+                <w:rFonts w:ascii="Arial" w:hAnsi="Arial"/>
+                <w:b w:val="0"/>
+                <w:i w:val="0"/>
+                <w:color w:val="111111"/>
+                <w:sz w:val="16"/>
+              </w:rPr>
+              <w:t>Current status</w:t>
+            </w:r>
+          </w:p>
+        </w:tc>
+        <w:tc>
+          <w:tcPr>
+            <w:tcW w:type="dxa" w:w="5645"/>
+            <w:shd w:fill="CFE2F3"/>
+            <w:tcBorders>
+              <w:top w:val="single" w:sz="9" w:color="000000"/>
+              <w:left w:val="single" w:sz="9" w:color="000000"/>
+              <w:bottom w:val="single" w:sz="9" w:color="000000"/>
+              <w:right w:val="single" w:sz="9" w:color="000000"/>
+              <w:insideH w:val="single" w:sz="9" w:color="000000"/>
+              <w:insideV w:val="single" w:sz="9" w:color="000000"/>
+            </w:tcBorders>
+            <w:tcMar>
+              <w:top w:w="82" w:type="dxa"/>
+              <w:start w:w="100" w:type="dxa"/>
+              <w:bottom w:w="82" w:type="dxa"/>
+              <w:end w:w="100" w:type="dxa"/>
+            </w:tcMar>
+            <w:vAlign w:val="center"/>
+          </w:tcPr>
+          <w:p>
+            <w:pPr>
+              <w:spacing w:after="0"/>
+            </w:pPr>
+            <w:r>
+              <w:rPr>
+                <w:rFonts w:ascii="Arial" w:hAnsi="Arial"/>
+                <w:b w:val="0"/>
+                <w:i w:val="0"/>
+                <w:color w:val="111111"/>
+                <w:sz w:val="16"/>
+              </w:rPr>
+              <w:t>Pilot validation needed</w:t>
+            </w:r>
+          </w:p>
+        </w:tc>
+      </w:tr>
+      <w:tr>
+        <w:trPr>
+          <w:cantSplit/>
+        </w:trPr>
+        <w:tc>
+          <w:tcPr>
+            <w:tcW w:type="dxa" w:w="1656"/>
+            <w:tcBorders>
+              <w:top w:val="single" w:sz="9" w:color="000000"/>
+              <w:left w:val="single" w:sz="9" w:color="000000"/>
+              <w:bottom w:val="single" w:sz="9" w:color="000000"/>
+              <w:right w:val="single" w:sz="9" w:color="000000"/>
+              <w:insideH w:val="single" w:sz="9" w:color="000000"/>
+              <w:insideV w:val="single" w:sz="9" w:color="000000"/>
+            </w:tcBorders>
+            <w:tcMar>
+              <w:top w:w="68" w:type="dxa"/>
+              <w:start w:w="100" w:type="dxa"/>
+              <w:bottom w:w="68" w:type="dxa"/>
+              <w:end w:w="100" w:type="dxa"/>
+            </w:tcMar>
+            <w:vAlign w:val="top"/>
+          </w:tcPr>
+          <w:p>
+            <w:pPr>
+              <w:spacing w:after="0" w:line="235" w:lineRule="auto"/>
+            </w:pPr>
+            <w:r>
+              <w:rPr>
+                <w:rFonts w:ascii="Arial" w:hAnsi="Arial"/>
+                <w:b w:val="0"/>
+                <w:i w:val="0"/>
+                <w:color w:val="111111"/>
+                <w:sz w:val="15"/>
+              </w:rPr>
+              <w:t>Fleet size</w:t>
+            </w:r>
+          </w:p>
+        </w:tc>
+        <w:tc>
+          <w:tcPr>
+            <w:tcW w:type="dxa" w:w="2376"/>
+            <w:tcBorders>
+              <w:top w:val="single" w:sz="9" w:color="000000"/>
+              <w:left w:val="single" w:sz="9" w:color="000000"/>
+              <w:bottom w:val="single" w:sz="9" w:color="000000"/>
+              <w:right w:val="single" w:sz="9" w:color="000000"/>
+              <w:insideH w:val="single" w:sz="9" w:color="000000"/>
+              <w:insideV w:val="single" w:sz="9" w:color="000000"/>
+            </w:tcBorders>
+            <w:tcMar>
+              <w:top w:w="68" w:type="dxa"/>
+              <w:start w:w="100" w:type="dxa"/>
+              <w:bottom w:w="68" w:type="dxa"/>
+              <w:end w:w="100" w:type="dxa"/>
+            </w:tcMar>
+            <w:vAlign w:val="top"/>
+          </w:tcPr>
+          <w:p>
+            <w:pPr>
+              <w:spacing w:after="0" w:line="235" w:lineRule="auto"/>
+            </w:pPr>
+            <w:r>
+              <w:rPr>
+                <w:rFonts w:ascii="Arial" w:hAnsi="Arial"/>
+                <w:b w:val="0"/>
+                <w:i w:val="0"/>
+                <w:color w:val="111111"/>
+                <w:sz w:val="15"/>
+              </w:rPr>
+              <w:t>1,943 vehicles | PROXY</w:t>
+            </w:r>
+          </w:p>
+        </w:tc>
+        <w:tc>
+          <w:tcPr>
+            <w:tcW w:type="dxa" w:w="5645"/>
+            <w:tcBorders>
+              <w:top w:val="single" w:sz="9" w:color="000000"/>
+              <w:left w:val="single" w:sz="9" w:color="000000"/>
+              <w:bottom w:val="single" w:sz="9" w:color="000000"/>
+              <w:right w:val="single" w:sz="9" w:color="000000"/>
+              <w:insideH w:val="single" w:sz="9" w:color="000000"/>
+              <w:insideV w:val="single" w:sz="9" w:color="000000"/>
+            </w:tcBorders>
+            <w:tcMar>
+              <w:top w:w="68" w:type="dxa"/>
+              <w:start w:w="100" w:type="dxa"/>
+              <w:bottom w:w="68" w:type="dxa"/>
+              <w:end w:w="100" w:type="dxa"/>
+            </w:tcMar>
+            <w:vAlign w:val="top"/>
+          </w:tcPr>
+          <w:p>
+            <w:pPr>
+              <w:spacing w:after="0" w:line="235" w:lineRule="auto"/>
+            </w:pPr>
+            <w:r>
+              <w:rPr>
+                <w:rFonts w:ascii="Arial" w:hAnsi="Arial"/>
+                <w:b w:val="0"/>
+                <w:i w:val="0"/>
+                <w:color w:val="111111"/>
+                <w:sz w:val="15"/>
+              </w:rPr>
+              <w:t>Confirm active fleet, duty cycle, service plan, spare ratio, and replacement phasing by corridor.</w:t>
+            </w:r>
+          </w:p>
+        </w:tc>
+      </w:tr>
+      <w:tr>
+        <w:trPr>
+          <w:cantSplit/>
+        </w:trPr>
+        <w:tc>
+          <w:tcPr>
+            <w:tcW w:type="dxa" w:w="1656"/>
+            <w:tcBorders>
+              <w:top w:val="single" w:sz="9" w:color="000000"/>
+              <w:left w:val="single" w:sz="9" w:color="000000"/>
+              <w:bottom w:val="single" w:sz="9" w:color="000000"/>
+              <w:right w:val="single" w:sz="9" w:color="000000"/>
+              <w:insideH w:val="single" w:sz="9" w:color="000000"/>
+              <w:insideV w:val="single" w:sz="9" w:color="000000"/>
+            </w:tcBorders>
+            <w:tcMar>
+              <w:top w:w="68" w:type="dxa"/>
+              <w:start w:w="100" w:type="dxa"/>
+              <w:bottom w:w="68" w:type="dxa"/>
+              <w:end w:w="100" w:type="dxa"/>
+            </w:tcMar>
+            <w:shd w:fill="F8FAFC"/>
+            <w:vAlign w:val="top"/>
+          </w:tcPr>
+          <w:p>
+            <w:pPr>
+              <w:spacing w:after="0" w:line="235" w:lineRule="auto"/>
+            </w:pPr>
+            <w:r>
+              <w:rPr>
+                <w:rFonts w:ascii="Arial" w:hAnsi="Arial"/>
+                <w:b w:val="0"/>
+                <w:i w:val="0"/>
+                <w:color w:val="111111"/>
+                <w:sz w:val="15"/>
+              </w:rPr>
+              <w:t>Vehicle cost</w:t>
+            </w:r>
+          </w:p>
+        </w:tc>
+        <w:tc>
+          <w:tcPr>
+            <w:tcW w:type="dxa" w:w="2376"/>
+            <w:tcBorders>
+              <w:top w:val="single" w:sz="9" w:color="000000"/>
+              <w:left w:val="single" w:sz="9" w:color="000000"/>
+              <w:bottom w:val="single" w:sz="9" w:color="000000"/>
+              <w:right w:val="single" w:sz="9" w:color="000000"/>
+              <w:insideH w:val="single" w:sz="9" w:color="000000"/>
+              <w:insideV w:val="single" w:sz="9" w:color="000000"/>
+            </w:tcBorders>
+            <w:tcMar>
+              <w:top w:w="68" w:type="dxa"/>
+              <w:start w:w="100" w:type="dxa"/>
+              <w:bottom w:w="68" w:type="dxa"/>
+              <w:end w:w="100" w:type="dxa"/>
+            </w:tcMar>
+            <w:shd w:fill="F8FAFC"/>
+            <w:vAlign w:val="top"/>
+          </w:tcPr>
+          <w:p>
+            <w:pPr>
+              <w:spacing w:after="0" w:line="235" w:lineRule="auto"/>
+            </w:pPr>
+            <w:r>
+              <w:rPr>
+                <w:rFonts w:ascii="Arial" w:hAnsi="Arial"/>
+                <w:b w:val="0"/>
+                <w:i w:val="0"/>
+                <w:color w:val="111111"/>
+                <w:sz w:val="15"/>
+              </w:rPr>
+              <w:t>PHP 2.5M/unit | PROXY</w:t>
+            </w:r>
+          </w:p>
+        </w:tc>
+        <w:tc>
+          <w:tcPr>
+            <w:tcW w:type="dxa" w:w="5645"/>
+            <w:tcBorders>
+              <w:top w:val="single" w:sz="9" w:color="000000"/>
+              <w:left w:val="single" w:sz="9" w:color="000000"/>
+              <w:bottom w:val="single" w:sz="9" w:color="000000"/>
+              <w:right w:val="single" w:sz="9" w:color="000000"/>
+              <w:insideH w:val="single" w:sz="9" w:color="000000"/>
+              <w:insideV w:val="single" w:sz="9" w:color="000000"/>
+            </w:tcBorders>
+            <w:tcMar>
+              <w:top w:w="68" w:type="dxa"/>
+              <w:start w:w="100" w:type="dxa"/>
+              <w:bottom w:w="68" w:type="dxa"/>
+              <w:end w:w="100" w:type="dxa"/>
+            </w:tcMar>
+            <w:shd w:fill="F8FAFC"/>
+            <w:vAlign w:val="top"/>
+          </w:tcPr>
+          <w:p>
+            <w:pPr>
+              <w:spacing w:after="0" w:line="235" w:lineRule="auto"/>
+            </w:pPr>
+            <w:r>
+              <w:rPr>
+                <w:rFonts w:ascii="Arial" w:hAnsi="Arial"/>
+                <w:b w:val="0"/>
+                <w:i w:val="0"/>
+                <w:color w:val="111111"/>
+                <w:sz w:val="15"/>
+              </w:rPr>
+              <w:t>Obtain supplier-neutral market evidence and define vehicle specification; do not treat the DOE planning value as a jeepney quote.</w:t>
+            </w:r>
+          </w:p>
+        </w:tc>
+      </w:tr>
+      <w:tr>
+        <w:trPr>
+          <w:cantSplit/>
+        </w:trPr>
+        <w:tc>
+          <w:tcPr>
+            <w:tcW w:type="dxa" w:w="1656"/>
+            <w:tcBorders>
+              <w:top w:val="single" w:sz="9" w:color="000000"/>
+              <w:left w:val="single" w:sz="9" w:color="000000"/>
+              <w:bottom w:val="single" w:sz="9" w:color="000000"/>
+              <w:right w:val="single" w:sz="9" w:color="000000"/>
+              <w:insideH w:val="single" w:sz="9" w:color="000000"/>
+              <w:insideV w:val="single" w:sz="9" w:color="000000"/>
+            </w:tcBorders>
+            <w:tcMar>
+              <w:top w:w="68" w:type="dxa"/>
+              <w:start w:w="100" w:type="dxa"/>
+              <w:bottom w:w="68" w:type="dxa"/>
+              <w:end w:w="100" w:type="dxa"/>
+            </w:tcMar>
+            <w:vAlign w:val="top"/>
+          </w:tcPr>
+          <w:p>
+            <w:pPr>
+              <w:spacing w:after="0" w:line="235" w:lineRule="auto"/>
+            </w:pPr>
+            <w:r>
+              <w:rPr>
+                <w:rFonts w:ascii="Arial" w:hAnsi="Arial"/>
+                <w:b w:val="0"/>
+                <w:i w:val="0"/>
+                <w:color w:val="111111"/>
+                <w:sz w:val="15"/>
+              </w:rPr>
+              <w:t>Charging</w:t>
+            </w:r>
+          </w:p>
+        </w:tc>
+        <w:tc>
+          <w:tcPr>
+            <w:tcW w:type="dxa" w:w="2376"/>
+            <w:tcBorders>
+              <w:top w:val="single" w:sz="9" w:color="000000"/>
+              <w:left w:val="single" w:sz="9" w:color="000000"/>
+              <w:bottom w:val="single" w:sz="9" w:color="000000"/>
+              <w:right w:val="single" w:sz="9" w:color="000000"/>
+              <w:insideH w:val="single" w:sz="9" w:color="000000"/>
+              <w:insideV w:val="single" w:sz="9" w:color="000000"/>
+            </w:tcBorders>
+            <w:tcMar>
+              <w:top w:w="68" w:type="dxa"/>
+              <w:start w:w="100" w:type="dxa"/>
+              <w:bottom w:w="68" w:type="dxa"/>
+              <w:end w:w="100" w:type="dxa"/>
+            </w:tcMar>
+            <w:vAlign w:val="top"/>
+          </w:tcPr>
+          <w:p>
+            <w:pPr>
+              <w:spacing w:after="0" w:line="235" w:lineRule="auto"/>
+            </w:pPr>
+            <w:r>
+              <w:rPr>
+                <w:rFonts w:ascii="Arial" w:hAnsi="Arial"/>
+                <w:b w:val="0"/>
+                <w:i w:val="0"/>
+                <w:color w:val="111111"/>
+                <w:sz w:val="15"/>
+              </w:rPr>
+              <w:t>102 stations | PROXY</w:t>
+            </w:r>
+          </w:p>
+        </w:tc>
+        <w:tc>
+          <w:tcPr>
+            <w:tcW w:type="dxa" w:w="5645"/>
+            <w:tcBorders>
+              <w:top w:val="single" w:sz="9" w:color="000000"/>
+              <w:left w:val="single" w:sz="9" w:color="000000"/>
+              <w:bottom w:val="single" w:sz="9" w:color="000000"/>
+              <w:right w:val="single" w:sz="9" w:color="000000"/>
+              <w:insideH w:val="single" w:sz="9" w:color="000000"/>
+              <w:insideV w:val="single" w:sz="9" w:color="000000"/>
+            </w:tcBorders>
+            <w:tcMar>
+              <w:top w:w="68" w:type="dxa"/>
+              <w:start w:w="100" w:type="dxa"/>
+              <w:bottom w:w="68" w:type="dxa"/>
+              <w:end w:w="100" w:type="dxa"/>
+            </w:tcMar>
+            <w:vAlign w:val="top"/>
+          </w:tcPr>
+          <w:p>
+            <w:pPr>
+              <w:spacing w:after="0" w:line="235" w:lineRule="auto"/>
+            </w:pPr>
+            <w:r>
+              <w:rPr>
+                <w:rFonts w:ascii="Arial" w:hAnsi="Arial"/>
+                <w:b w:val="0"/>
+                <w:i w:val="0"/>
+                <w:color w:val="111111"/>
+                <w:sz w:val="15"/>
+              </w:rPr>
+              <w:t>Validate charger power, depot layout, operating windows, utility capacity, interconnection, and civil works.</w:t>
+            </w:r>
+          </w:p>
+        </w:tc>
+      </w:tr>
+      <w:tr>
+        <w:trPr>
+          <w:cantSplit/>
+        </w:trPr>
+        <w:tc>
+          <w:tcPr>
+            <w:tcW w:type="dxa" w:w="1656"/>
+            <w:tcBorders>
+              <w:top w:val="single" w:sz="9" w:color="000000"/>
+              <w:left w:val="single" w:sz="9" w:color="000000"/>
+              <w:bottom w:val="single" w:sz="9" w:color="000000"/>
+              <w:right w:val="single" w:sz="9" w:color="000000"/>
+              <w:insideH w:val="single" w:sz="9" w:color="000000"/>
+              <w:insideV w:val="single" w:sz="9" w:color="000000"/>
+            </w:tcBorders>
+            <w:tcMar>
+              <w:top w:w="68" w:type="dxa"/>
+              <w:start w:w="100" w:type="dxa"/>
+              <w:bottom w:w="68" w:type="dxa"/>
+              <w:end w:w="100" w:type="dxa"/>
+            </w:tcMar>
+            <w:shd w:fill="F8FAFC"/>
+            <w:vAlign w:val="top"/>
+          </w:tcPr>
+          <w:p>
+            <w:pPr>
+              <w:spacing w:after="0" w:line="235" w:lineRule="auto"/>
+            </w:pPr>
+            <w:r>
+              <w:rPr>
+                <w:rFonts w:ascii="Arial" w:hAnsi="Arial"/>
+                <w:b w:val="0"/>
+                <w:i w:val="0"/>
+                <w:color w:val="111111"/>
+                <w:sz w:val="15"/>
+              </w:rPr>
+              <w:t>Financing</w:t>
+            </w:r>
+          </w:p>
+        </w:tc>
+        <w:tc>
+          <w:tcPr>
+            <w:tcW w:type="dxa" w:w="2376"/>
+            <w:tcBorders>
+              <w:top w:val="single" w:sz="9" w:color="000000"/>
+              <w:left w:val="single" w:sz="9" w:color="000000"/>
+              <w:bottom w:val="single" w:sz="9" w:color="000000"/>
+              <w:right w:val="single" w:sz="9" w:color="000000"/>
+              <w:insideH w:val="single" w:sz="9" w:color="000000"/>
+              <w:insideV w:val="single" w:sz="9" w:color="000000"/>
+            </w:tcBorders>
+            <w:tcMar>
+              <w:top w:w="68" w:type="dxa"/>
+              <w:start w:w="100" w:type="dxa"/>
+              <w:bottom w:w="68" w:type="dxa"/>
+              <w:end w:w="100" w:type="dxa"/>
+            </w:tcMar>
+            <w:shd w:fill="F8FAFC"/>
+            <w:vAlign w:val="top"/>
+          </w:tcPr>
+          <w:p>
+            <w:pPr>
+              <w:spacing w:after="0" w:line="235" w:lineRule="auto"/>
+            </w:pPr>
+            <w:r>
+              <w:rPr>
+                <w:rFonts w:ascii="Arial" w:hAnsi="Arial"/>
+                <w:b w:val="0"/>
+                <w:i w:val="0"/>
+                <w:color w:val="111111"/>
+                <w:sz w:val="15"/>
+              </w:rPr>
+              <w:t>MISSING</w:t>
+            </w:r>
+          </w:p>
+        </w:tc>
+        <w:tc>
+          <w:tcPr>
+            <w:tcW w:type="dxa" w:w="5645"/>
+            <w:tcBorders>
+              <w:top w:val="single" w:sz="9" w:color="000000"/>
+              <w:left w:val="single" w:sz="9" w:color="000000"/>
+              <w:bottom w:val="single" w:sz="9" w:color="000000"/>
+              <w:right w:val="single" w:sz="9" w:color="000000"/>
+              <w:insideH w:val="single" w:sz="9" w:color="000000"/>
+              <w:insideV w:val="single" w:sz="9" w:color="000000"/>
+            </w:tcBorders>
+            <w:tcMar>
+              <w:top w:w="68" w:type="dxa"/>
+              <w:start w:w="100" w:type="dxa"/>
+              <w:bottom w:w="68" w:type="dxa"/>
+              <w:end w:w="100" w:type="dxa"/>
+            </w:tcMar>
+            <w:shd w:fill="F8FAFC"/>
+            <w:vAlign w:val="top"/>
+          </w:tcPr>
+          <w:p>
+            <w:pPr>
+              <w:spacing w:after="0" w:line="235" w:lineRule="auto"/>
+            </w:pPr>
+            <w:r>
+              <w:rPr>
+                <w:rFonts w:ascii="Arial" w:hAnsi="Arial"/>
+                <w:b w:val="0"/>
+                <w:i w:val="0"/>
+                <w:color w:val="111111"/>
+                <w:sz w:val="15"/>
+              </w:rPr>
+              <w:t>Confirm tariff structure, equity/debt source, grants or subsidy, repayment terms, insurance, and ownership model.</w:t>
+            </w:r>
+          </w:p>
+        </w:tc>
+      </w:tr>
+    </w:tbl>
+    <w:p>
+      <w:pPr>
+        <w:spacing w:before="0" w:after="60" w:line="254" w:lineRule="auto"/>
+      </w:pPr>
+      <w:r>
+        <w:rPr>
+          <w:rFonts w:ascii="Arial" w:hAnsi="Arial"/>
+          <w:b w:val="0"/>
+          <w:i w:val="0"/>
+          <w:color w:val="111111"/>
+          <w:sz w:val="16"/>
+        </w:rPr>
+        <w:t>Excluded from the current capital proxy: land or depot acquisition, civil works, distribution-system upgrades, interconnection fees, battery replacement, taxes, insurance, financing costs, and operations and maintenance.</w:t>
+      </w:r>
+    </w:p>
+    <w:p>
+      <w:pPr>
+        <w:pStyle w:val="Heading1"/>
+        <w:keepNext/>
+        <w:spacing w:before="80" w:after="40"/>
+      </w:pPr>
+      <w:r>
+        <w:rPr>
+          <w:rFonts w:ascii="Arial" w:hAnsi="Arial"/>
+          <w:b/>
+          <w:i w:val="0"/>
+          <w:color w:val="0B2E59"/>
+          <w:sz w:val="23"/>
+        </w:rPr>
+        <w:t>DATA LICENSING &amp; ATTRIBUTION</w:t>
+      </w:r>
+    </w:p>
+    <w:p>
+      <w:pPr>
+        <w:pStyle w:val="ListBullet"/>
+        <w:spacing w:before="0" w:after="20" w:line="240" w:lineRule="auto"/>
+        <w:ind w:left="317" w:hanging="202"/>
+      </w:pPr>
+      <w:r>
+        <w:rPr>
+          <w:rFonts w:ascii="Arial" w:hAnsi="Arial"/>
+          <w:b w:val="0"/>
+          <w:i w:val="0"/>
+          <w:color w:val="111111"/>
+          <w:sz w:val="16"/>
+        </w:rPr>
+        <w:t>Project code is MIT-licensed; source data retain their own licenses and conditions.</w:t>
+      </w:r>
+    </w:p>
+    <w:p>
+      <w:pPr>
+        <w:pStyle w:val="ListBullet"/>
+        <w:spacing w:before="0" w:after="20" w:line="240" w:lineRule="auto"/>
+        <w:ind w:left="317" w:hanging="202"/>
+      </w:pPr>
+      <w:r>
+        <w:rPr>
+          <w:rFonts w:ascii="Arial" w:hAnsi="Arial"/>
+          <w:b w:val="0"/>
+          <w:i w:val="0"/>
+          <w:color w:val="111111"/>
+          <w:sz w:val="16"/>
+        </w:rPr>
+        <w:t>OpenStreetMap route and infrastructure data require attribution to OpenStreetMap contributors and are used under ODbL. Attribution must remain visible in maps, exports, decision packs, and future field-data updates.</w:t>
+      </w:r>
+    </w:p>
+    <w:p>
+      <w:pPr>
+        <w:pStyle w:val="ListBullet"/>
+        <w:spacing w:before="0" w:after="20" w:line="240" w:lineRule="auto"/>
+        <w:ind w:left="317" w:hanging="202"/>
+      </w:pPr>
+      <w:r>
+        <w:rPr>
+          <w:rFonts w:ascii="Arial" w:hAnsi="Arial"/>
+          <w:b w:val="0"/>
+          <w:i w:val="0"/>
+          <w:color w:val="111111"/>
+          <w:sz w:val="16"/>
+        </w:rPr>
+        <w:t>The source registry records URLs, retrieval dates, license notes, checksums, and claim scope. Pilot owners review these before every release.</w:t>
+      </w:r>
+    </w:p>
+    <w:p>
+      <w:pPr>
+        <w:pStyle w:val="ListBullet"/>
+        <w:spacing w:before="0" w:after="20" w:line="240" w:lineRule="auto"/>
+        <w:ind w:left="317" w:hanging="202"/>
+      </w:pPr>
+      <w:r>
+        <w:rPr>
+          <w:rFonts w:ascii="Arial" w:hAnsi="Arial"/>
+          <w:b w:val="0"/>
+          <w:i w:val="0"/>
+          <w:color w:val="111111"/>
+          <w:sz w:val="16"/>
+        </w:rPr>
+        <w:t>New local evidence is accepted only with an accountable source, observation date, permission basis where relevant, and a field-level claim status.</w:t>
+      </w:r>
+    </w:p>
+    <w:p>
+      <w:pPr>
+        <w:pStyle w:val="Heading1"/>
+        <w:keepNext/>
+        <w:spacing w:before="80" w:after="40"/>
+      </w:pPr>
+      <w:r>
+        <w:rPr>
+          <w:rFonts w:ascii="Arial" w:hAnsi="Arial"/>
+          <w:b/>
+          <w:i w:val="0"/>
+          <w:color w:val="0B2E59"/>
+          <w:sz w:val="23"/>
+        </w:rPr>
+        <w:t>SUBMISSION HEAD START</w:t>
+      </w:r>
+    </w:p>
+    <w:p>
+      <w:pPr>
+        <w:spacing w:before="0" w:after="60" w:line="254" w:lineRule="auto"/>
+      </w:pPr>
+      <w:r>
+        <w:rPr>
+          <w:rFonts w:ascii="Arial" w:hAnsi="Arial"/>
+          <w:b w:val="0"/>
+          <w:i w:val="0"/>
+          <w:color w:val="111111"/>
+          <w:sz w:val="16"/>
+        </w:rPr>
+        <w:t>The hackathon build already seeds Month 2 with 20 dated OSM route matches and 20 observed member-way geometries, raising usable source geometries from 2 to 22. These records reduce the initial desk-review burden but do not prove active operations or franchise authority.</w:t>
+      </w:r>
+    </w:p>
+    <w:p>
+      <w:pPr>
+        <w:spacing w:before="0" w:after="0" w:line="254" w:lineRule="auto"/>
+      </w:pPr>
+      <w:r>
+        <w:rPr>
+          <w:rFonts w:ascii="Arial" w:hAnsi="Arial"/>
+          <w:b w:val="0"/>
+          <w:i w:val="0"/>
+          <w:color w:val="111111"/>
+          <w:sz w:val="14"/>
+        </w:rPr>
+        <w:t>Baseline traceability: build r2z-d4c8d4cc709a | scenario scn-e0f12f397e | portfolio prt-fd6de9d793</w:t>
+      </w:r>
+    </w:p>
+    <w:p>
+      <w:pPr>
+        <w:keepNext/>
+        <w:pageBreakBefore/>
+        <w:spacing w:after="20"/>
+        <w:ind w:left="-1123" w:right="-1123"/>
+      </w:pPr>
+      <w:r>
+        <w:drawing>
+          <wp:inline xmlns:a="http://schemas.openxmlformats.org/drawingml/2006/main" xmlns:pic="http://schemas.openxmlformats.org/drawingml/2006/picture">
+            <wp:extent cx="7560000" cy="935728"/>
+            <wp:docPr id="5" name="Picture 5" descr="AI x City Climate Action Hackathon 2026 partner banner" title="AI x City Climate Action Hackathon 2026"/>
+            <wp:cNvGraphicFramePr>
+              <a:graphicFrameLocks noChangeAspect="1"/>
+            </wp:cNvGraphicFramePr>
+            <a:graphic>
+              <a:graphicData uri="http://schemas.openxmlformats.org/drawingml/2006/picture">
+                <pic:pic>
+                  <pic:nvPicPr>
+                    <pic:cNvPr id="0" name="hackathon-template-banner.png"/>
+                    <pic:cNvPicPr/>
+                  </pic:nvPicPr>
+                  <pic:blipFill>
+                    <a:blip r:embed="rId10"/>
+                    <a:stretch>
+                      <a:fillRect/>
+                    </a:stretch>
+                  </pic:blipFill>
+                  <pic:spPr>
+                    <a:xfrm>
+                      <a:off x="0" y="0"/>
+                      <a:ext cx="7560000" cy="935728"/>
+                    </a:xfrm>
+                    <a:prstGeom prst="rect"/>
+                  </pic:spPr>
+                </pic:pic>
+              </a:graphicData>
+            </a:graphic>
+          </wp:inline>
+        </w:drawing>
+      </w:r>
+    </w:p>
+    <w:p>
+      <w:pPr>
+        <w:keepNext/>
+        <w:spacing w:before="0" w:after="20"/>
+      </w:pPr>
+      <w:hyperlink r:id="rId11">
+        <w:r>
+          <w:rPr>
+            <w:rFonts w:ascii="Arial" w:hAnsi="Arial"/>
+            <w:color w:val="075A91"/>
+            <w:u w:val="single"/>
+            <w:sz w:val="17"/>
+          </w:rPr>
+          <w:t>GitHub: https://github.com/qjmre23/Route2Zero</w:t>
+        </w:r>
+      </w:hyperlink>
+      <w:r>
+        <w:rPr>
+          <w:rFonts w:ascii="Arial" w:hAnsi="Arial"/>
+          <w:b w:val="0"/>
+          <w:i w:val="0"/>
+          <w:color w:val="4B5563"/>
+          <w:sz w:val="16"/>
+        </w:rPr>
+        <w:t xml:space="preserve">   |   </w:t>
+      </w:r>
+      <w:hyperlink r:id="rId12">
+        <w:r>
+          <w:rPr>
+            <w:rFonts w:ascii="Arial" w:hAnsi="Arial"/>
+            <w:color w:val="075A91"/>
+            <w:u w:val="single"/>
+            <w:sz w:val="17"/>
+          </w:rPr>
+          <w:t>Live dashboard: https://route2zero.netlify.app/</w:t>
+        </w:r>
+      </w:hyperlink>
+    </w:p>
+    <w:p>
+      <w:pPr>
+        <w:keepNext/>
         <w:spacing w:before="0" w:after="40"/>
         <w:jc w:val="right"/>
       </w:pPr>
@@ -5536,9 +6533,9 @@
         <w:b w:val="0"/>
         <w:i w:val="0"/>
         <w:color w:val="4B5563"/>
-        <w:sz w:val="14"/>
-      </w:rPr>
-      <w:t xml:space="preserve">Team Larpers  |  Route2Zero  |  </w:t>
+        <w:sz w:val="11"/>
+      </w:rPr>
+      <w:t xml:space="preserve">Team Larpers | Route2Zero | r2z-d4c8d4cc709a | scn-e0f12f397e | prt-fd6de9d793 | </w:t>
     </w:r>
     <w:r>
       <w:rPr>
@@ -5559,7 +6556,7 @@
         <w:color w:val="4B5563"/>
         <w:sz w:val="14"/>
       </w:rPr>
-      <w:t xml:space="preserve"> of 4</w:t>
+      <w:t xml:space="preserve"> of 5</w:t>
     </w:r>
   </w:p>
 </w:ftr>

</xml_diff>

<commit_message>
Record tour narration and reconcile submission artifacts
</commit_message>
<xml_diff>
--- a/output/submission/Route2Zero_Team_Larpers_Pilot_Plan.docx
+++ b/output/submission/Route2Zero_Team_Larpers_Pilot_Plan.docx
@@ -4896,7 +4896,7 @@
           <w:color w:val="111111"/>
           <w:sz w:val="16"/>
         </w:rPr>
-        <w:t>The hackathon build already seeds Month 2 with 20 dated OSM route matches and 20 observed member-way geometries, raising usable source geometries from 2 to 22. These records reduce the initial desk-review burden but do not prove active operations or franchise authority.</w:t>
+        <w:t>The evidence set includes 20 dated OSM route matches, 20 observed member-way geometries, and 22 usable source geometries. These records reduce the initial desk-review burden but do not prove active operations or franchise authority.</w:t>
       </w:r>
     </w:p>
     <w:p>
@@ -5653,7 +5653,7 @@
                 <w:color w:val="111111"/>
                 <w:sz w:val="14"/>
               </w:rPr>
-              <w:t>TRISTIAN JAMES CABALAR</w:t>
+              <w:t>Joaquin Sarmiento</w:t>
             </w:r>
           </w:p>
         </w:tc>
@@ -5764,7 +5764,7 @@
                 <w:color w:val="111111"/>
                 <w:sz w:val="14"/>
               </w:rPr>
-              <w:t>JOHN MICHAEL PALAGANAS</w:t>
+              <w:t>Prince Marl Mirasol</w:t>
             </w:r>
           </w:p>
         </w:tc>
@@ -6506,7 +6506,7 @@
           <w:color w:val="111111"/>
           <w:sz w:val="14"/>
         </w:rPr>
-        <w:t>Handover: final build, model card, source registry, validation ledgers, scenario library, decision pack, issue register, refresh/retraining runbook, governance notes, and a city owner for each unresolved issue. Scale requires local adapters, recalibration, and validation; the Metro Manila model is not copied unchanged.</w:t>
+        <w:t>Handover: final build, model card, source registry, field-observation template, validation ledgers, scenario library, decision pack, issue register, scheduled source-freshness check, refresh/retraining runbook, governance notes, and a city owner for each unresolved issue. Scale requires local adapters, recalibration, and validation; the Metro Manila model is not copied unchanged.</w:t>
       </w:r>
     </w:p>
     <w:sectPr>

</xml_diff>

<commit_message>
Rebuild corrected release and submission artifacts
</commit_message>
<xml_diff>
--- a/output/submission/Route2Zero_Team_Larpers_Pilot_Plan.docx
+++ b/output/submission/Route2Zero_Team_Larpers_Pilot_Plan.docx
@@ -262,7 +262,7 @@
           <w:color w:val="111111"/>
           <w:sz w:val="17"/>
         </w:rPr>
-        <w:t>Target up to three partner LGUs, subject to city pairing and pilot agreement.</w:t>
+        <w:t>Begin with one lead LGU; add one comparison LGU only after Gate 1 and a signed second-city pilot agreement.</w:t>
       </w:r>
     </w:p>
     <w:p>
@@ -1952,7 +1952,7 @@
                 <w:color w:val="111111"/>
                 <w:sz w:val="14"/>
               </w:rPr>
-              <w:t>Calibrated climate scenario; charging/operator cards; optimizer-ready constraints.</w:t>
+              <w:t>Calibrated climate scenario; charging/operator cards; selection-ready constraints.</w:t>
             </w:r>
           </w:p>
         </w:tc>
@@ -2558,7 +2558,7 @@
           <w:color w:val="111111"/>
           <w:sz w:val="14"/>
         </w:rPr>
-        <w:t>Baseline traceability: build r2z-d4c8d4cc709a | scenario scn-e0f12f397e | service model service-v1-266e0b1d</w:t>
+        <w:t>Baseline traceability: build r2z-a7181752a17d | scenario scn-e0f12f397e | service model service-v1-266e0b1d</w:t>
       </w:r>
     </w:p>
     <w:p>
@@ -2969,6 +2969,82 @@
                 <w:color w:val="111111"/>
                 <w:sz w:val="15"/>
               </w:rPr>
+              <w:t>AI task value</w:t>
+            </w:r>
+          </w:p>
+        </w:tc>
+        <w:tc>
+          <w:tcPr>
+            <w:tcW w:type="dxa" w:w="7877"/>
+            <w:tcBorders>
+              <w:top w:val="single" w:sz="9" w:color="000000"/>
+              <w:left w:val="single" w:sz="9" w:color="000000"/>
+              <w:bottom w:val="single" w:sz="9" w:color="000000"/>
+              <w:right w:val="single" w:sz="9" w:color="000000"/>
+              <w:insideH w:val="single" w:sz="9" w:color="000000"/>
+              <w:insideV w:val="single" w:sz="9" w:color="000000"/>
+            </w:tcBorders>
+            <w:tcMar>
+              <w:top w:w="68" w:type="dxa"/>
+              <w:start w:w="100" w:type="dxa"/>
+              <w:bottom w:w="68" w:type="dxa"/>
+              <w:end w:w="100" w:type="dxa"/>
+            </w:tcMar>
+            <w:vAlign w:val="top"/>
+          </w:tcPr>
+          <w:p>
+            <w:pPr>
+              <w:spacing w:after="0" w:line="235" w:lineRule="auto"/>
+            </w:pPr>
+            <w:r>
+              <w:rPr>
+                <w:rFonts w:ascii="Arial" w:hAnsi="Arial"/>
+                <w:b w:val="0"/>
+                <w:i w:val="0"/>
+                <w:color w:val="111111"/>
+                <w:sz w:val="15"/>
+              </w:rPr>
+              <w:t>Compare AI-assisted and analyst-only evidence review using time-to-first brief, missed-evidence rate, factual errors, and unsupported claims.</w:t>
+            </w:r>
+          </w:p>
+        </w:tc>
+      </w:tr>
+      <w:tr>
+        <w:trPr>
+          <w:cantSplit/>
+        </w:trPr>
+        <w:tc>
+          <w:tcPr>
+            <w:tcW w:type="dxa" w:w="1800"/>
+            <w:tcBorders>
+              <w:top w:val="single" w:sz="9" w:color="000000"/>
+              <w:left w:val="single" w:sz="9" w:color="000000"/>
+              <w:bottom w:val="single" w:sz="9" w:color="000000"/>
+              <w:right w:val="single" w:sz="9" w:color="000000"/>
+              <w:insideH w:val="single" w:sz="9" w:color="000000"/>
+              <w:insideV w:val="single" w:sz="9" w:color="000000"/>
+            </w:tcBorders>
+            <w:tcMar>
+              <w:top w:w="68" w:type="dxa"/>
+              <w:start w:w="100" w:type="dxa"/>
+              <w:bottom w:w="68" w:type="dxa"/>
+              <w:end w:w="100" w:type="dxa"/>
+            </w:tcMar>
+            <w:shd w:fill="F8FAFC"/>
+            <w:vAlign w:val="top"/>
+          </w:tcPr>
+          <w:p>
+            <w:pPr>
+              <w:spacing w:after="0" w:line="235" w:lineRule="auto"/>
+            </w:pPr>
+            <w:r>
+              <w:rPr>
+                <w:rFonts w:ascii="Arial" w:hAnsi="Arial"/>
+                <w:b w:val="0"/>
+                <w:i w:val="0"/>
+                <w:color w:val="111111"/>
+                <w:sz w:val="15"/>
+              </w:rPr>
               <w:t>Decision quality</w:t>
             </w:r>
           </w:p>
@@ -2990,6 +3066,7 @@
               <w:bottom w:w="68" w:type="dxa"/>
               <w:end w:w="100" w:type="dxa"/>
             </w:tcMar>
+            <w:shd w:fill="F8FAFC"/>
             <w:vAlign w:val="top"/>
           </w:tcPr>
           <w:p>
@@ -3030,7 +3107,6 @@
               <w:bottom w:w="68" w:type="dxa"/>
               <w:end w:w="100" w:type="dxa"/>
             </w:tcMar>
-            <w:shd w:fill="F8FAFC"/>
             <w:vAlign w:val="top"/>
           </w:tcPr>
           <w:p>
@@ -3066,7 +3142,6 @@
               <w:bottom w:w="68" w:type="dxa"/>
               <w:end w:w="100" w:type="dxa"/>
             </w:tcMar>
-            <w:shd w:fill="F8FAFC"/>
             <w:vAlign w:val="top"/>
           </w:tcPr>
           <w:p>
@@ -3107,6 +3182,7 @@
               <w:bottom w:w="68" w:type="dxa"/>
               <w:end w:w="100" w:type="dxa"/>
             </w:tcMar>
+            <w:shd w:fill="F8FAFC"/>
             <w:vAlign w:val="top"/>
           </w:tcPr>
           <w:p>
@@ -3142,6 +3218,7 @@
               <w:bottom w:w="68" w:type="dxa"/>
               <w:end w:w="100" w:type="dxa"/>
             </w:tcMar>
+            <w:shd w:fill="F8FAFC"/>
             <w:vAlign w:val="top"/>
           </w:tcPr>
           <w:p>
@@ -4911,7 +4988,7 @@
           <w:color w:val="111111"/>
           <w:sz w:val="14"/>
         </w:rPr>
-        <w:t>Baseline traceability: build r2z-d4c8d4cc709a | scenario scn-e0f12f397e | portfolio prt-fd6de9d793</w:t>
+        <w:t>Baseline traceability: build r2z-a7181752a17d | scenario scn-e0f12f397e | portfolio prt-fd6de9d793</w:t>
       </w:r>
     </w:p>
     <w:p>
@@ -6535,7 +6612,7 @@
         <w:color w:val="4B5563"/>
         <w:sz w:val="11"/>
       </w:rPr>
-      <w:t xml:space="preserve">Team Larpers | Route2Zero | r2z-d4c8d4cc709a | scn-e0f12f397e | prt-fd6de9d793 | </w:t>
+      <w:t xml:space="preserve">Team Larpers | Route2Zero | r2z-a7181752a17d | scn-e0f12f397e | prt-fd6de9d793 | </w:t>
     </w:r>
     <w:r>
       <w:rPr>

</xml_diff>